<commit_message>
Ispravke u projektnoj dokumentaciji
</commit_message>
<xml_diff>
--- a/Filip_Popovic_2023_0089_Andrija_Zecevic_2023_0045_Domaci_zadatak.docx (2).docx
+++ b/Filip_Popovic_2023_0089_Andrija_Zecevic_2023_0045_Domaci_zadatak.docx (2).docx
@@ -250,13 +250,144 @@
           <w:r>
             <w:fldChar w:fldCharType="separate"/>
           </w:r>
-          <w:hyperlink w:anchor="_Toc238910161" w:history="1">
+          <w:bookmarkStart w:id="0" w:name="_GoBack"/>
+          <w:bookmarkEnd w:id="0"/>
+          <w:r>
+            <w:rPr>
+              <w:rStyle w:val="Hyperlink"/>
+              <w:noProof/>
+            </w:rPr>
+            <w:fldChar w:fldCharType="begin"/>
+          </w:r>
+          <w:r>
+            <w:rPr>
+              <w:rStyle w:val="Hyperlink"/>
+              <w:noProof/>
+            </w:rPr>
+            <w:instrText xml:space="preserve"> </w:instrText>
+          </w:r>
+          <w:r>
+            <w:rPr>
+              <w:noProof/>
+            </w:rPr>
+            <w:instrText>HYPERLINK \l "_Toc238910780"</w:instrText>
+          </w:r>
+          <w:r>
+            <w:rPr>
+              <w:rStyle w:val="Hyperlink"/>
+              <w:noProof/>
+            </w:rPr>
+            <w:instrText xml:space="preserve"> </w:instrText>
+          </w:r>
+          <w:r>
+            <w:rPr>
+              <w:rStyle w:val="Hyperlink"/>
+              <w:noProof/>
+            </w:rPr>
+          </w:r>
+          <w:r>
+            <w:rPr>
+              <w:rStyle w:val="Hyperlink"/>
+              <w:noProof/>
+            </w:rPr>
+            <w:fldChar w:fldCharType="separate"/>
+          </w:r>
+          <w:r>
+            <w:rPr>
+              <w:rStyle w:val="Hyperlink"/>
+              <w:noProof/>
+            </w:rPr>
+            <w:t>1</w:t>
+          </w:r>
+          <w:r>
+            <w:rPr>
+              <w:rFonts w:asciiTheme="minorHAnsi" w:eastAsiaTheme="minorEastAsia" w:hAnsiTheme="minorHAnsi" w:cstheme="minorBidi"/>
+              <w:noProof/>
+            </w:rPr>
+            <w:tab/>
+          </w:r>
+          <w:r>
+            <w:rPr>
+              <w:rStyle w:val="Hyperlink"/>
+              <w:noProof/>
+            </w:rPr>
+            <w:t>Tema seminarskog rada i korisnički zahtev</w:t>
+          </w:r>
+          <w:r>
+            <w:rPr>
+              <w:noProof/>
+              <w:webHidden/>
+            </w:rPr>
+            <w:tab/>
+          </w:r>
+          <w:r>
+            <w:rPr>
+              <w:noProof/>
+              <w:webHidden/>
+            </w:rPr>
+            <w:fldChar w:fldCharType="begin"/>
+          </w:r>
+          <w:r>
+            <w:rPr>
+              <w:noProof/>
+              <w:webHidden/>
+            </w:rPr>
+            <w:instrText xml:space="preserve"> PAGEREF _Toc238910780 \h </w:instrText>
+          </w:r>
+          <w:r>
+            <w:rPr>
+              <w:noProof/>
+              <w:webHidden/>
+            </w:rPr>
+          </w:r>
+          <w:r>
+            <w:rPr>
+              <w:noProof/>
+              <w:webHidden/>
+            </w:rPr>
+            <w:fldChar w:fldCharType="separate"/>
+          </w:r>
+          <w:r>
+            <w:rPr>
+              <w:noProof/>
+              <w:webHidden/>
+            </w:rPr>
+            <w:t>4</w:t>
+          </w:r>
+          <w:r>
+            <w:rPr>
+              <w:noProof/>
+              <w:webHidden/>
+            </w:rPr>
+            <w:fldChar w:fldCharType="end"/>
+          </w:r>
+          <w:r>
+            <w:rPr>
+              <w:rStyle w:val="Hyperlink"/>
+              <w:noProof/>
+            </w:rPr>
+            <w:fldChar w:fldCharType="end"/>
+          </w:r>
+        </w:p>
+        <w:p>
+          <w:pPr>
+            <w:pStyle w:val="TOC2"/>
+            <w:tabs>
+              <w:tab w:val="left" w:pos="880"/>
+              <w:tab w:val="right" w:leader="dot" w:pos="9350"/>
+            </w:tabs>
+            <w:rPr>
+              <w:rFonts w:asciiTheme="minorHAnsi" w:eastAsiaTheme="minorEastAsia" w:hAnsiTheme="minorHAnsi" w:cstheme="minorBidi"/>
+              <w:noProof/>
+            </w:rPr>
+          </w:pPr>
+          <w:hyperlink w:anchor="_Toc238910781" w:history="1">
             <w:r>
               <w:rPr>
                 <w:rStyle w:val="Hyperlink"/>
                 <w:noProof/>
               </w:rPr>
-              <w:t>1</w:t>
+              <w:t>1.1</w:t>
             </w:r>
             <w:r>
               <w:rPr>
@@ -270,7 +401,7 @@
                 <w:rStyle w:val="Hyperlink"/>
                 <w:noProof/>
               </w:rPr>
-              <w:t>Tema seminarskog rada i korisnički zahtev</w:t>
+              <w:t>Tema rada</w:t>
             </w:r>
             <w:r>
               <w:rPr>
@@ -291,7 +422,7 @@
                 <w:noProof/>
                 <w:webHidden/>
               </w:rPr>
-              <w:instrText xml:space="preserve"> PAGEREF _Toc238910161 \h </w:instrText>
+              <w:instrText xml:space="preserve"> PAGEREF _Toc238910781 \h </w:instrText>
             </w:r>
             <w:r>
               <w:rPr>
@@ -334,13 +465,13 @@
               <w:noProof/>
             </w:rPr>
           </w:pPr>
-          <w:hyperlink w:anchor="_Toc238910162" w:history="1">
+          <w:hyperlink w:anchor="_Toc238910782" w:history="1">
             <w:r>
               <w:rPr>
                 <w:rStyle w:val="Hyperlink"/>
                 <w:noProof/>
               </w:rPr>
-              <w:t>1.1</w:t>
+              <w:t>1.2</w:t>
             </w:r>
             <w:r>
               <w:rPr>
@@ -354,7 +485,7 @@
                 <w:rStyle w:val="Hyperlink"/>
                 <w:noProof/>
               </w:rPr>
-              <w:t>Tema rada</w:t>
+              <w:t>Opis problema</w:t>
             </w:r>
             <w:r>
               <w:rPr>
@@ -375,7 +506,7 @@
                 <w:noProof/>
                 <w:webHidden/>
               </w:rPr>
-              <w:instrText xml:space="preserve"> PAGEREF _Toc238910162 \h </w:instrText>
+              <w:instrText xml:space="preserve"> PAGEREF _Toc238910782 \h </w:instrText>
             </w:r>
             <w:r>
               <w:rPr>
@@ -418,13 +549,13 @@
               <w:noProof/>
             </w:rPr>
           </w:pPr>
-          <w:hyperlink w:anchor="_Toc238910163" w:history="1">
+          <w:hyperlink w:anchor="_Toc238910783" w:history="1">
             <w:r>
               <w:rPr>
                 <w:rStyle w:val="Hyperlink"/>
                 <w:noProof/>
               </w:rPr>
-              <w:t>1.2</w:t>
+              <w:t>1.3</w:t>
             </w:r>
             <w:r>
               <w:rPr>
@@ -438,7 +569,7 @@
                 <w:rStyle w:val="Hyperlink"/>
                 <w:noProof/>
               </w:rPr>
-              <w:t>Opis problema</w:t>
+              <w:t>Korisnički zahtev</w:t>
             </w:r>
             <w:r>
               <w:rPr>
@@ -459,7 +590,7 @@
                 <w:noProof/>
                 <w:webHidden/>
               </w:rPr>
-              <w:instrText xml:space="preserve"> PAGEREF _Toc238910163 \h </w:instrText>
+              <w:instrText xml:space="preserve"> PAGEREF _Toc238910783 \h </w:instrText>
             </w:r>
             <w:r>
               <w:rPr>
@@ -502,13 +633,13 @@
               <w:noProof/>
             </w:rPr>
           </w:pPr>
-          <w:hyperlink w:anchor="_Toc238910164" w:history="1">
+          <w:hyperlink w:anchor="_Toc238910784" w:history="1">
             <w:r>
               <w:rPr>
                 <w:rStyle w:val="Hyperlink"/>
                 <w:noProof/>
               </w:rPr>
-              <w:t>1.3</w:t>
+              <w:t>1.4</w:t>
             </w:r>
             <w:r>
               <w:rPr>
@@ -522,7 +653,7 @@
                 <w:rStyle w:val="Hyperlink"/>
                 <w:noProof/>
               </w:rPr>
-              <w:t>Korisnički zahtev</w:t>
+              <w:t>Korisnici sistema</w:t>
             </w:r>
             <w:r>
               <w:rPr>
@@ -543,7 +674,7 @@
                 <w:noProof/>
                 <w:webHidden/>
               </w:rPr>
-              <w:instrText xml:space="preserve"> PAGEREF _Toc238910164 \h </w:instrText>
+              <w:instrText xml:space="preserve"> PAGEREF _Toc238910784 \h </w:instrText>
             </w:r>
             <w:r>
               <w:rPr>
@@ -563,7 +694,7 @@
                 <w:noProof/>
                 <w:webHidden/>
               </w:rPr>
-              <w:t>4</w:t>
+              <w:t>5</w:t>
             </w:r>
             <w:r>
               <w:rPr>
@@ -586,13 +717,13 @@
               <w:noProof/>
             </w:rPr>
           </w:pPr>
-          <w:hyperlink w:anchor="_Toc238910165" w:history="1">
+          <w:hyperlink w:anchor="_Toc238910785" w:history="1">
             <w:r>
               <w:rPr>
                 <w:rStyle w:val="Hyperlink"/>
                 <w:noProof/>
               </w:rPr>
-              <w:t>1.4</w:t>
+              <w:t>1.5</w:t>
             </w:r>
             <w:r>
               <w:rPr>
@@ -606,7 +737,7 @@
                 <w:rStyle w:val="Hyperlink"/>
                 <w:noProof/>
               </w:rPr>
-              <w:t>Korisnici sistema</w:t>
+              <w:t>Organizacija podataka</w:t>
             </w:r>
             <w:r>
               <w:rPr>
@@ -627,7 +758,91 @@
                 <w:noProof/>
                 <w:webHidden/>
               </w:rPr>
-              <w:instrText xml:space="preserve"> PAGEREF _Toc238910165 \h </w:instrText>
+              <w:instrText xml:space="preserve"> PAGEREF _Toc238910785 \h </w:instrText>
+            </w:r>
+            <w:r>
+              <w:rPr>
+                <w:noProof/>
+                <w:webHidden/>
+              </w:rPr>
+            </w:r>
+            <w:r>
+              <w:rPr>
+                <w:noProof/>
+                <w:webHidden/>
+              </w:rPr>
+              <w:fldChar w:fldCharType="separate"/>
+            </w:r>
+            <w:r>
+              <w:rPr>
+                <w:noProof/>
+                <w:webHidden/>
+              </w:rPr>
+              <w:t>5</w:t>
+            </w:r>
+            <w:r>
+              <w:rPr>
+                <w:noProof/>
+                <w:webHidden/>
+              </w:rPr>
+              <w:fldChar w:fldCharType="end"/>
+            </w:r>
+          </w:hyperlink>
+        </w:p>
+        <w:p>
+          <w:pPr>
+            <w:pStyle w:val="TOC1"/>
+            <w:tabs>
+              <w:tab w:val="left" w:pos="440"/>
+              <w:tab w:val="right" w:leader="dot" w:pos="9350"/>
+            </w:tabs>
+            <w:rPr>
+              <w:rFonts w:asciiTheme="minorHAnsi" w:eastAsiaTheme="minorEastAsia" w:hAnsiTheme="minorHAnsi" w:cstheme="minorBidi"/>
+              <w:noProof/>
+            </w:rPr>
+          </w:pPr>
+          <w:hyperlink w:anchor="_Toc238910786" w:history="1">
+            <w:r>
+              <w:rPr>
+                <w:rStyle w:val="Hyperlink"/>
+                <w:noProof/>
+              </w:rPr>
+              <w:t>2</w:t>
+            </w:r>
+            <w:r>
+              <w:rPr>
+                <w:rFonts w:asciiTheme="minorHAnsi" w:eastAsiaTheme="minorEastAsia" w:hAnsiTheme="minorHAnsi" w:cstheme="minorBidi"/>
+                <w:noProof/>
+              </w:rPr>
+              <w:tab/>
+            </w:r>
+            <w:r>
+              <w:rPr>
+                <w:rStyle w:val="Hyperlink"/>
+                <w:noProof/>
+              </w:rPr>
+              <w:t>Implementacija</w:t>
+            </w:r>
+            <w:r>
+              <w:rPr>
+                <w:noProof/>
+                <w:webHidden/>
+              </w:rPr>
+              <w:tab/>
+            </w:r>
+            <w:r>
+              <w:rPr>
+                <w:noProof/>
+                <w:webHidden/>
+              </w:rPr>
+              <w:fldChar w:fldCharType="begin"/>
+            </w:r>
+            <w:r>
+              <w:rPr>
+                <w:noProof/>
+                <w:webHidden/>
+              </w:rPr>
+              <w:instrText xml:space="preserve"> PAGEREF _Toc238910786 \h </w:instrText>
             </w:r>
             <w:r>
               <w:rPr>
@@ -670,13 +885,13 @@
               <w:noProof/>
             </w:rPr>
           </w:pPr>
-          <w:hyperlink w:anchor="_Toc238910166" w:history="1">
+          <w:hyperlink w:anchor="_Toc238910787" w:history="1">
             <w:r>
               <w:rPr>
                 <w:rStyle w:val="Hyperlink"/>
                 <w:noProof/>
               </w:rPr>
-              <w:t>1.5</w:t>
+              <w:t>2.1</w:t>
             </w:r>
             <w:r>
               <w:rPr>
@@ -690,7 +905,7 @@
                 <w:rStyle w:val="Hyperlink"/>
                 <w:noProof/>
               </w:rPr>
-              <w:t>Organizacija podataka</w:t>
+              <w:t>Struktura baze podataka i migracije</w:t>
             </w:r>
             <w:r>
               <w:rPr>
@@ -711,7 +926,7 @@
                 <w:noProof/>
                 <w:webHidden/>
               </w:rPr>
-              <w:instrText xml:space="preserve"> PAGEREF _Toc238910166 \h </w:instrText>
+              <w:instrText xml:space="preserve"> PAGEREF _Toc238910787 \h </w:instrText>
             </w:r>
             <w:r>
               <w:rPr>
@@ -732,6 +947,678 @@
                 <w:webHidden/>
               </w:rPr>
               <w:t>5</w:t>
+            </w:r>
+            <w:r>
+              <w:rPr>
+                <w:noProof/>
+                <w:webHidden/>
+              </w:rPr>
+              <w:fldChar w:fldCharType="end"/>
+            </w:r>
+          </w:hyperlink>
+        </w:p>
+        <w:p>
+          <w:pPr>
+            <w:pStyle w:val="TOC2"/>
+            <w:tabs>
+              <w:tab w:val="left" w:pos="880"/>
+              <w:tab w:val="right" w:leader="dot" w:pos="9350"/>
+            </w:tabs>
+            <w:rPr>
+              <w:rFonts w:asciiTheme="minorHAnsi" w:eastAsiaTheme="minorEastAsia" w:hAnsiTheme="minorHAnsi" w:cstheme="minorBidi"/>
+              <w:noProof/>
+            </w:rPr>
+          </w:pPr>
+          <w:hyperlink w:anchor="_Toc238910788" w:history="1">
+            <w:r>
+              <w:rPr>
+                <w:rStyle w:val="Hyperlink"/>
+                <w:noProof/>
+              </w:rPr>
+              <w:t>2.2</w:t>
+            </w:r>
+            <w:r>
+              <w:rPr>
+                <w:rFonts w:asciiTheme="minorHAnsi" w:eastAsiaTheme="minorEastAsia" w:hAnsiTheme="minorHAnsi" w:cstheme="minorBidi"/>
+                <w:noProof/>
+              </w:rPr>
+              <w:tab/>
+            </w:r>
+            <w:r>
+              <w:rPr>
+                <w:rStyle w:val="Hyperlink"/>
+                <w:noProof/>
+              </w:rPr>
+              <w:t>Modeli i veze između entiteta</w:t>
+            </w:r>
+            <w:r>
+              <w:rPr>
+                <w:noProof/>
+                <w:webHidden/>
+              </w:rPr>
+              <w:tab/>
+            </w:r>
+            <w:r>
+              <w:rPr>
+                <w:noProof/>
+                <w:webHidden/>
+              </w:rPr>
+              <w:fldChar w:fldCharType="begin"/>
+            </w:r>
+            <w:r>
+              <w:rPr>
+                <w:noProof/>
+                <w:webHidden/>
+              </w:rPr>
+              <w:instrText xml:space="preserve"> PAGEREF _Toc238910788 \h </w:instrText>
+            </w:r>
+            <w:r>
+              <w:rPr>
+                <w:noProof/>
+                <w:webHidden/>
+              </w:rPr>
+            </w:r>
+            <w:r>
+              <w:rPr>
+                <w:noProof/>
+                <w:webHidden/>
+              </w:rPr>
+              <w:fldChar w:fldCharType="separate"/>
+            </w:r>
+            <w:r>
+              <w:rPr>
+                <w:noProof/>
+                <w:webHidden/>
+              </w:rPr>
+              <w:t>9</w:t>
+            </w:r>
+            <w:r>
+              <w:rPr>
+                <w:noProof/>
+                <w:webHidden/>
+              </w:rPr>
+              <w:fldChar w:fldCharType="end"/>
+            </w:r>
+          </w:hyperlink>
+        </w:p>
+        <w:p>
+          <w:pPr>
+            <w:pStyle w:val="TOC2"/>
+            <w:tabs>
+              <w:tab w:val="left" w:pos="880"/>
+              <w:tab w:val="right" w:leader="dot" w:pos="9350"/>
+            </w:tabs>
+            <w:rPr>
+              <w:rFonts w:asciiTheme="minorHAnsi" w:eastAsiaTheme="minorEastAsia" w:hAnsiTheme="minorHAnsi" w:cstheme="minorBidi"/>
+              <w:noProof/>
+            </w:rPr>
+          </w:pPr>
+          <w:hyperlink w:anchor="_Toc238910789" w:history="1">
+            <w:r>
+              <w:rPr>
+                <w:rStyle w:val="Hyperlink"/>
+                <w:noProof/>
+              </w:rPr>
+              <w:t>2.3</w:t>
+            </w:r>
+            <w:r>
+              <w:rPr>
+                <w:rFonts w:asciiTheme="minorHAnsi" w:eastAsiaTheme="minorEastAsia" w:hAnsiTheme="minorHAnsi" w:cstheme="minorBidi"/>
+                <w:noProof/>
+              </w:rPr>
+              <w:tab/>
+            </w:r>
+            <w:r>
+              <w:rPr>
+                <w:rStyle w:val="Hyperlink"/>
+                <w:noProof/>
+              </w:rPr>
+              <w:t>Autentifikacija korisnika</w:t>
+            </w:r>
+            <w:r>
+              <w:rPr>
+                <w:noProof/>
+                <w:webHidden/>
+              </w:rPr>
+              <w:tab/>
+            </w:r>
+            <w:r>
+              <w:rPr>
+                <w:noProof/>
+                <w:webHidden/>
+              </w:rPr>
+              <w:fldChar w:fldCharType="begin"/>
+            </w:r>
+            <w:r>
+              <w:rPr>
+                <w:noProof/>
+                <w:webHidden/>
+              </w:rPr>
+              <w:instrText xml:space="preserve"> PAGEREF _Toc238910789 \h </w:instrText>
+            </w:r>
+            <w:r>
+              <w:rPr>
+                <w:noProof/>
+                <w:webHidden/>
+              </w:rPr>
+            </w:r>
+            <w:r>
+              <w:rPr>
+                <w:noProof/>
+                <w:webHidden/>
+              </w:rPr>
+              <w:fldChar w:fldCharType="separate"/>
+            </w:r>
+            <w:r>
+              <w:rPr>
+                <w:noProof/>
+                <w:webHidden/>
+              </w:rPr>
+              <w:t>11</w:t>
+            </w:r>
+            <w:r>
+              <w:rPr>
+                <w:noProof/>
+                <w:webHidden/>
+              </w:rPr>
+              <w:fldChar w:fldCharType="end"/>
+            </w:r>
+          </w:hyperlink>
+        </w:p>
+        <w:p>
+          <w:pPr>
+            <w:pStyle w:val="TOC2"/>
+            <w:tabs>
+              <w:tab w:val="left" w:pos="880"/>
+              <w:tab w:val="right" w:leader="dot" w:pos="9350"/>
+            </w:tabs>
+            <w:rPr>
+              <w:rFonts w:asciiTheme="minorHAnsi" w:eastAsiaTheme="minorEastAsia" w:hAnsiTheme="minorHAnsi" w:cstheme="minorBidi"/>
+              <w:noProof/>
+            </w:rPr>
+          </w:pPr>
+          <w:hyperlink w:anchor="_Toc238910790" w:history="1">
+            <w:r>
+              <w:rPr>
+                <w:rStyle w:val="Hyperlink"/>
+                <w:noProof/>
+              </w:rPr>
+              <w:t>2.4</w:t>
+            </w:r>
+            <w:r>
+              <w:rPr>
+                <w:rFonts w:asciiTheme="minorHAnsi" w:eastAsiaTheme="minorEastAsia" w:hAnsiTheme="minorHAnsi" w:cstheme="minorBidi"/>
+                <w:noProof/>
+              </w:rPr>
+              <w:tab/>
+            </w:r>
+            <w:r>
+              <w:rPr>
+                <w:rStyle w:val="Hyperlink"/>
+                <w:noProof/>
+              </w:rPr>
+              <w:t>Rute i kontrola pristupa</w:t>
+            </w:r>
+            <w:r>
+              <w:rPr>
+                <w:noProof/>
+                <w:webHidden/>
+              </w:rPr>
+              <w:tab/>
+            </w:r>
+            <w:r>
+              <w:rPr>
+                <w:noProof/>
+                <w:webHidden/>
+              </w:rPr>
+              <w:fldChar w:fldCharType="begin"/>
+            </w:r>
+            <w:r>
+              <w:rPr>
+                <w:noProof/>
+                <w:webHidden/>
+              </w:rPr>
+              <w:instrText xml:space="preserve"> PAGEREF _Toc238910790 \h </w:instrText>
+            </w:r>
+            <w:r>
+              <w:rPr>
+                <w:noProof/>
+                <w:webHidden/>
+              </w:rPr>
+            </w:r>
+            <w:r>
+              <w:rPr>
+                <w:noProof/>
+                <w:webHidden/>
+              </w:rPr>
+              <w:fldChar w:fldCharType="separate"/>
+            </w:r>
+            <w:r>
+              <w:rPr>
+                <w:noProof/>
+                <w:webHidden/>
+              </w:rPr>
+              <w:t>13</w:t>
+            </w:r>
+            <w:r>
+              <w:rPr>
+                <w:noProof/>
+                <w:webHidden/>
+              </w:rPr>
+              <w:fldChar w:fldCharType="end"/>
+            </w:r>
+          </w:hyperlink>
+        </w:p>
+        <w:p>
+          <w:pPr>
+            <w:pStyle w:val="TOC2"/>
+            <w:tabs>
+              <w:tab w:val="left" w:pos="880"/>
+              <w:tab w:val="right" w:leader="dot" w:pos="9350"/>
+            </w:tabs>
+            <w:rPr>
+              <w:rFonts w:asciiTheme="minorHAnsi" w:eastAsiaTheme="minorEastAsia" w:hAnsiTheme="minorHAnsi" w:cstheme="minorBidi"/>
+              <w:noProof/>
+            </w:rPr>
+          </w:pPr>
+          <w:hyperlink w:anchor="_Toc238910791" w:history="1">
+            <w:r>
+              <w:rPr>
+                <w:rStyle w:val="Hyperlink"/>
+                <w:noProof/>
+              </w:rPr>
+              <w:t>2.5</w:t>
+            </w:r>
+            <w:r>
+              <w:rPr>
+                <w:rFonts w:asciiTheme="minorHAnsi" w:eastAsiaTheme="minorEastAsia" w:hAnsiTheme="minorHAnsi" w:cstheme="minorBidi"/>
+                <w:noProof/>
+              </w:rPr>
+              <w:tab/>
+            </w:r>
+            <w:r>
+              <w:rPr>
+                <w:rStyle w:val="Hyperlink"/>
+                <w:noProof/>
+              </w:rPr>
+              <w:t>Prikaz aktuelnih događaja</w:t>
+            </w:r>
+            <w:r>
+              <w:rPr>
+                <w:noProof/>
+                <w:webHidden/>
+              </w:rPr>
+              <w:tab/>
+            </w:r>
+            <w:r>
+              <w:rPr>
+                <w:noProof/>
+                <w:webHidden/>
+              </w:rPr>
+              <w:fldChar w:fldCharType="begin"/>
+            </w:r>
+            <w:r>
+              <w:rPr>
+                <w:noProof/>
+                <w:webHidden/>
+              </w:rPr>
+              <w:instrText xml:space="preserve"> PAGEREF _Toc238910791 \h </w:instrText>
+            </w:r>
+            <w:r>
+              <w:rPr>
+                <w:noProof/>
+                <w:webHidden/>
+              </w:rPr>
+            </w:r>
+            <w:r>
+              <w:rPr>
+                <w:noProof/>
+                <w:webHidden/>
+              </w:rPr>
+              <w:fldChar w:fldCharType="separate"/>
+            </w:r>
+            <w:r>
+              <w:rPr>
+                <w:noProof/>
+                <w:webHidden/>
+              </w:rPr>
+              <w:t>16</w:t>
+            </w:r>
+            <w:r>
+              <w:rPr>
+                <w:noProof/>
+                <w:webHidden/>
+              </w:rPr>
+              <w:fldChar w:fldCharType="end"/>
+            </w:r>
+          </w:hyperlink>
+        </w:p>
+        <w:p>
+          <w:pPr>
+            <w:pStyle w:val="TOC2"/>
+            <w:tabs>
+              <w:tab w:val="left" w:pos="880"/>
+              <w:tab w:val="right" w:leader="dot" w:pos="9350"/>
+            </w:tabs>
+            <w:rPr>
+              <w:rFonts w:asciiTheme="minorHAnsi" w:eastAsiaTheme="minorEastAsia" w:hAnsiTheme="minorHAnsi" w:cstheme="minorBidi"/>
+              <w:noProof/>
+            </w:rPr>
+          </w:pPr>
+          <w:hyperlink w:anchor="_Toc238910792" w:history="1">
+            <w:r>
+              <w:rPr>
+                <w:rStyle w:val="Hyperlink"/>
+                <w:noProof/>
+              </w:rPr>
+              <w:t>2.6</w:t>
+            </w:r>
+            <w:r>
+              <w:rPr>
+                <w:rFonts w:asciiTheme="minorHAnsi" w:eastAsiaTheme="minorEastAsia" w:hAnsiTheme="minorHAnsi" w:cstheme="minorBidi"/>
+                <w:noProof/>
+              </w:rPr>
+              <w:tab/>
+            </w:r>
+            <w:r>
+              <w:rPr>
+                <w:rStyle w:val="Hyperlink"/>
+                <w:noProof/>
+              </w:rPr>
+              <w:t>Filtriranje i paginacija</w:t>
+            </w:r>
+            <w:r>
+              <w:rPr>
+                <w:noProof/>
+                <w:webHidden/>
+              </w:rPr>
+              <w:tab/>
+            </w:r>
+            <w:r>
+              <w:rPr>
+                <w:noProof/>
+                <w:webHidden/>
+              </w:rPr>
+              <w:fldChar w:fldCharType="begin"/>
+            </w:r>
+            <w:r>
+              <w:rPr>
+                <w:noProof/>
+                <w:webHidden/>
+              </w:rPr>
+              <w:instrText xml:space="preserve"> PAGEREF _Toc238910792 \h </w:instrText>
+            </w:r>
+            <w:r>
+              <w:rPr>
+                <w:noProof/>
+                <w:webHidden/>
+              </w:rPr>
+            </w:r>
+            <w:r>
+              <w:rPr>
+                <w:noProof/>
+                <w:webHidden/>
+              </w:rPr>
+              <w:fldChar w:fldCharType="separate"/>
+            </w:r>
+            <w:r>
+              <w:rPr>
+                <w:noProof/>
+                <w:webHidden/>
+              </w:rPr>
+              <w:t>17</w:t>
+            </w:r>
+            <w:r>
+              <w:rPr>
+                <w:noProof/>
+                <w:webHidden/>
+              </w:rPr>
+              <w:fldChar w:fldCharType="end"/>
+            </w:r>
+          </w:hyperlink>
+        </w:p>
+        <w:p>
+          <w:pPr>
+            <w:pStyle w:val="TOC2"/>
+            <w:tabs>
+              <w:tab w:val="left" w:pos="880"/>
+              <w:tab w:val="right" w:leader="dot" w:pos="9350"/>
+            </w:tabs>
+            <w:rPr>
+              <w:rFonts w:asciiTheme="minorHAnsi" w:eastAsiaTheme="minorEastAsia" w:hAnsiTheme="minorHAnsi" w:cstheme="minorBidi"/>
+              <w:noProof/>
+            </w:rPr>
+          </w:pPr>
+          <w:hyperlink w:anchor="_Toc238910793" w:history="1">
+            <w:r>
+              <w:rPr>
+                <w:rStyle w:val="Hyperlink"/>
+                <w:noProof/>
+              </w:rPr>
+              <w:t>2.7</w:t>
+            </w:r>
+            <w:r>
+              <w:rPr>
+                <w:rFonts w:asciiTheme="minorHAnsi" w:eastAsiaTheme="minorEastAsia" w:hAnsiTheme="minorHAnsi" w:cstheme="minorBidi"/>
+                <w:noProof/>
+              </w:rPr>
+              <w:tab/>
+            </w:r>
+            <w:r>
+              <w:rPr>
+                <w:rStyle w:val="Hyperlink"/>
+                <w:noProof/>
+              </w:rPr>
+              <w:t>Rang lista timova</w:t>
+            </w:r>
+            <w:r>
+              <w:rPr>
+                <w:noProof/>
+                <w:webHidden/>
+              </w:rPr>
+              <w:tab/>
+            </w:r>
+            <w:r>
+              <w:rPr>
+                <w:noProof/>
+                <w:webHidden/>
+              </w:rPr>
+              <w:fldChar w:fldCharType="begin"/>
+            </w:r>
+            <w:r>
+              <w:rPr>
+                <w:noProof/>
+                <w:webHidden/>
+              </w:rPr>
+              <w:instrText xml:space="preserve"> PAGEREF _Toc238910793 \h </w:instrText>
+            </w:r>
+            <w:r>
+              <w:rPr>
+                <w:noProof/>
+                <w:webHidden/>
+              </w:rPr>
+            </w:r>
+            <w:r>
+              <w:rPr>
+                <w:noProof/>
+                <w:webHidden/>
+              </w:rPr>
+              <w:fldChar w:fldCharType="separate"/>
+            </w:r>
+            <w:r>
+              <w:rPr>
+                <w:noProof/>
+                <w:webHidden/>
+              </w:rPr>
+              <w:t>18</w:t>
+            </w:r>
+            <w:r>
+              <w:rPr>
+                <w:noProof/>
+                <w:webHidden/>
+              </w:rPr>
+              <w:fldChar w:fldCharType="end"/>
+            </w:r>
+          </w:hyperlink>
+        </w:p>
+        <w:p>
+          <w:pPr>
+            <w:pStyle w:val="TOC2"/>
+            <w:tabs>
+              <w:tab w:val="left" w:pos="880"/>
+              <w:tab w:val="right" w:leader="dot" w:pos="9350"/>
+            </w:tabs>
+            <w:rPr>
+              <w:rFonts w:asciiTheme="minorHAnsi" w:eastAsiaTheme="minorEastAsia" w:hAnsiTheme="minorHAnsi" w:cstheme="minorBidi"/>
+              <w:noProof/>
+            </w:rPr>
+          </w:pPr>
+          <w:hyperlink w:anchor="_Toc238910794" w:history="1">
+            <w:r>
+              <w:rPr>
+                <w:rStyle w:val="Hyperlink"/>
+                <w:noProof/>
+              </w:rPr>
+              <w:t>2.8</w:t>
+            </w:r>
+            <w:r>
+              <w:rPr>
+                <w:rFonts w:asciiTheme="minorHAnsi" w:eastAsiaTheme="minorEastAsia" w:hAnsiTheme="minorHAnsi" w:cstheme="minorBidi"/>
+                <w:noProof/>
+              </w:rPr>
+              <w:tab/>
+            </w:r>
+            <w:r>
+              <w:rPr>
+                <w:rStyle w:val="Hyperlink"/>
+                <w:noProof/>
+              </w:rPr>
+              <w:t>Obrada grešaka u JSON format</w:t>
+            </w:r>
+            <w:r>
+              <w:rPr>
+                <w:noProof/>
+                <w:webHidden/>
+              </w:rPr>
+              <w:tab/>
+            </w:r>
+            <w:r>
+              <w:rPr>
+                <w:noProof/>
+                <w:webHidden/>
+              </w:rPr>
+              <w:fldChar w:fldCharType="begin"/>
+            </w:r>
+            <w:r>
+              <w:rPr>
+                <w:noProof/>
+                <w:webHidden/>
+              </w:rPr>
+              <w:instrText xml:space="preserve"> PAGEREF _Toc238910794 \h </w:instrText>
+            </w:r>
+            <w:r>
+              <w:rPr>
+                <w:noProof/>
+                <w:webHidden/>
+              </w:rPr>
+            </w:r>
+            <w:r>
+              <w:rPr>
+                <w:noProof/>
+                <w:webHidden/>
+              </w:rPr>
+              <w:fldChar w:fldCharType="separate"/>
+            </w:r>
+            <w:r>
+              <w:rPr>
+                <w:noProof/>
+                <w:webHidden/>
+              </w:rPr>
+              <w:t>19</w:t>
+            </w:r>
+            <w:r>
+              <w:rPr>
+                <w:noProof/>
+                <w:webHidden/>
+              </w:rPr>
+              <w:fldChar w:fldCharType="end"/>
+            </w:r>
+          </w:hyperlink>
+        </w:p>
+        <w:p>
+          <w:pPr>
+            <w:pStyle w:val="TOC2"/>
+            <w:tabs>
+              <w:tab w:val="left" w:pos="880"/>
+              <w:tab w:val="right" w:leader="dot" w:pos="9350"/>
+            </w:tabs>
+            <w:rPr>
+              <w:rFonts w:asciiTheme="minorHAnsi" w:eastAsiaTheme="minorEastAsia" w:hAnsiTheme="minorHAnsi" w:cstheme="minorBidi"/>
+              <w:noProof/>
+            </w:rPr>
+          </w:pPr>
+          <w:hyperlink w:anchor="_Toc238910795" w:history="1">
+            <w:r>
+              <w:rPr>
+                <w:rStyle w:val="Hyperlink"/>
+                <w:noProof/>
+              </w:rPr>
+              <w:t>2.9</w:t>
+            </w:r>
+            <w:r>
+              <w:rPr>
+                <w:rFonts w:asciiTheme="minorHAnsi" w:eastAsiaTheme="minorEastAsia" w:hAnsiTheme="minorHAnsi" w:cstheme="minorBidi"/>
+                <w:noProof/>
+              </w:rPr>
+              <w:tab/>
+            </w:r>
+            <w:r>
+              <w:rPr>
+                <w:rStyle w:val="Hyperlink"/>
+                <w:noProof/>
+              </w:rPr>
+              <w:t>Zaštita od dvostrukog unosa rezultata</w:t>
+            </w:r>
+            <w:r>
+              <w:rPr>
+                <w:noProof/>
+                <w:webHidden/>
+              </w:rPr>
+              <w:tab/>
+            </w:r>
+            <w:r>
+              <w:rPr>
+                <w:noProof/>
+                <w:webHidden/>
+              </w:rPr>
+              <w:fldChar w:fldCharType="begin"/>
+            </w:r>
+            <w:r>
+              <w:rPr>
+                <w:noProof/>
+                <w:webHidden/>
+              </w:rPr>
+              <w:instrText xml:space="preserve"> PAGEREF _Toc238910795 \h </w:instrText>
+            </w:r>
+            <w:r>
+              <w:rPr>
+                <w:noProof/>
+                <w:webHidden/>
+              </w:rPr>
+            </w:r>
+            <w:r>
+              <w:rPr>
+                <w:noProof/>
+                <w:webHidden/>
+              </w:rPr>
+              <w:fldChar w:fldCharType="separate"/>
+            </w:r>
+            <w:r>
+              <w:rPr>
+                <w:noProof/>
+                <w:webHidden/>
+              </w:rPr>
+              <w:t>20</w:t>
             </w:r>
             <w:r>
               <w:rPr>
@@ -754,13 +1641,13 @@
               <w:noProof/>
             </w:rPr>
           </w:pPr>
-          <w:hyperlink w:anchor="_Toc238910167" w:history="1">
+          <w:hyperlink w:anchor="_Toc238910796" w:history="1">
             <w:r>
               <w:rPr>
                 <w:rStyle w:val="Hyperlink"/>
                 <w:noProof/>
               </w:rPr>
-              <w:t>2</w:t>
+              <w:t>3</w:t>
             </w:r>
             <w:r>
               <w:rPr>
@@ -774,7 +1661,7 @@
                 <w:rStyle w:val="Hyperlink"/>
                 <w:noProof/>
               </w:rPr>
-              <w:t>Implementacija</w:t>
+              <w:t>Korisničko uputstvo</w:t>
             </w:r>
             <w:r>
               <w:rPr>
@@ -795,7 +1682,7 @@
                 <w:noProof/>
                 <w:webHidden/>
               </w:rPr>
-              <w:instrText xml:space="preserve"> PAGEREF _Toc238910167 \h </w:instrText>
+              <w:instrText xml:space="preserve"> PAGEREF _Toc238910796 \h </w:instrText>
             </w:r>
             <w:r>
               <w:rPr>
@@ -815,7 +1702,7 @@
                 <w:noProof/>
                 <w:webHidden/>
               </w:rPr>
-              <w:t>5</w:t>
+              <w:t>21</w:t>
             </w:r>
             <w:r>
               <w:rPr>
@@ -838,13 +1725,13 @@
               <w:noProof/>
             </w:rPr>
           </w:pPr>
-          <w:hyperlink w:anchor="_Toc238910168" w:history="1">
+          <w:hyperlink w:anchor="_Toc238910797" w:history="1">
             <w:r>
               <w:rPr>
                 <w:rStyle w:val="Hyperlink"/>
                 <w:noProof/>
               </w:rPr>
-              <w:t>2.1</w:t>
+              <w:t>3.1</w:t>
             </w:r>
             <w:r>
               <w:rPr>
@@ -858,7 +1745,7 @@
                 <w:rStyle w:val="Hyperlink"/>
                 <w:noProof/>
               </w:rPr>
-              <w:t>Struktura baze podataka i migracije</w:t>
+              <w:t>Registracija korisnika</w:t>
             </w:r>
             <w:r>
               <w:rPr>
@@ -879,7 +1766,7 @@
                 <w:noProof/>
                 <w:webHidden/>
               </w:rPr>
-              <w:instrText xml:space="preserve"> PAGEREF _Toc238910168 \h </w:instrText>
+              <w:instrText xml:space="preserve"> PAGEREF _Toc238910797 \h </w:instrText>
             </w:r>
             <w:r>
               <w:rPr>
@@ -899,7 +1786,7 @@
                 <w:noProof/>
                 <w:webHidden/>
               </w:rPr>
-              <w:t>5</w:t>
+              <w:t>21</w:t>
             </w:r>
             <w:r>
               <w:rPr>
@@ -922,13 +1809,13 @@
               <w:noProof/>
             </w:rPr>
           </w:pPr>
-          <w:hyperlink w:anchor="_Toc238910169" w:history="1">
+          <w:hyperlink w:anchor="_Toc238910798" w:history="1">
             <w:r>
               <w:rPr>
                 <w:rStyle w:val="Hyperlink"/>
                 <w:noProof/>
               </w:rPr>
-              <w:t>2.2</w:t>
+              <w:t>3.2</w:t>
             </w:r>
             <w:r>
               <w:rPr>
@@ -942,7 +1829,7 @@
                 <w:rStyle w:val="Hyperlink"/>
                 <w:noProof/>
               </w:rPr>
-              <w:t>Modeli i veze između entiteta</w:t>
+              <w:t>Prijava korisnika</w:t>
             </w:r>
             <w:r>
               <w:rPr>
@@ -963,7 +1850,7 @@
                 <w:noProof/>
                 <w:webHidden/>
               </w:rPr>
-              <w:instrText xml:space="preserve"> PAGEREF _Toc238910169 \h </w:instrText>
+              <w:instrText xml:space="preserve"> PAGEREF _Toc238910798 \h </w:instrText>
             </w:r>
             <w:r>
               <w:rPr>
@@ -983,7 +1870,7 @@
                 <w:noProof/>
                 <w:webHidden/>
               </w:rPr>
-              <w:t>9</w:t>
+              <w:t>22</w:t>
             </w:r>
             <w:r>
               <w:rPr>
@@ -1006,13 +1893,14 @@
               <w:noProof/>
             </w:rPr>
           </w:pPr>
-          <w:hyperlink w:anchor="_Toc238910170" w:history="1">
+          <w:hyperlink w:anchor="_Toc238910799" w:history="1">
             <w:r>
               <w:rPr>
                 <w:rStyle w:val="Hyperlink"/>
                 <w:noProof/>
-              </w:rPr>
-              <w:t>2.3</w:t>
+                <w:lang w:val="fr-FR"/>
+              </w:rPr>
+              <w:t>3.3</w:t>
             </w:r>
             <w:r>
               <w:rPr>
@@ -1025,8 +1913,9 @@
               <w:rPr>
                 <w:rStyle w:val="Hyperlink"/>
                 <w:noProof/>
-              </w:rPr>
-              <w:t>Autentifikacija korisnika</w:t>
+                <w:lang w:val="fr-FR"/>
+              </w:rPr>
+              <w:t>Pristup zaštićenoj ruti sa tokenom</w:t>
             </w:r>
             <w:r>
               <w:rPr>
@@ -1047,7 +1936,7 @@
                 <w:noProof/>
                 <w:webHidden/>
               </w:rPr>
-              <w:instrText xml:space="preserve"> PAGEREF _Toc238910170 \h </w:instrText>
+              <w:instrText xml:space="preserve"> PAGEREF _Toc238910799 \h </w:instrText>
             </w:r>
             <w:r>
               <w:rPr>
@@ -1067,7 +1956,7 @@
                 <w:noProof/>
                 <w:webHidden/>
               </w:rPr>
-              <w:t>11</w:t>
+              <w:t>23</w:t>
             </w:r>
             <w:r>
               <w:rPr>
@@ -1090,13 +1979,13 @@
               <w:noProof/>
             </w:rPr>
           </w:pPr>
-          <w:hyperlink w:anchor="_Toc238910171" w:history="1">
+          <w:hyperlink w:anchor="_Toc238910800" w:history="1">
             <w:r>
               <w:rPr>
                 <w:rStyle w:val="Hyperlink"/>
                 <w:noProof/>
               </w:rPr>
-              <w:t>2.4</w:t>
+              <w:t>3.4</w:t>
             </w:r>
             <w:r>
               <w:rPr>
@@ -1110,7 +1999,7 @@
                 <w:rStyle w:val="Hyperlink"/>
                 <w:noProof/>
               </w:rPr>
-              <w:t>Rute i kontrola pristupa</w:t>
+              <w:t>Pristup zaštićenoj ruti bez tokena</w:t>
             </w:r>
             <w:r>
               <w:rPr>
@@ -1131,7 +2020,7 @@
                 <w:noProof/>
                 <w:webHidden/>
               </w:rPr>
-              <w:instrText xml:space="preserve"> PAGEREF _Toc238910171 \h </w:instrText>
+              <w:instrText xml:space="preserve"> PAGEREF _Toc238910800 \h </w:instrText>
             </w:r>
             <w:r>
               <w:rPr>
@@ -1151,7 +2040,7 @@
                 <w:noProof/>
                 <w:webHidden/>
               </w:rPr>
-              <w:t>13</w:t>
+              <w:t>24</w:t>
             </w:r>
             <w:r>
               <w:rPr>
@@ -1174,13 +2063,13 @@
               <w:noProof/>
             </w:rPr>
           </w:pPr>
-          <w:hyperlink w:anchor="_Toc238910172" w:history="1">
+          <w:hyperlink w:anchor="_Toc238910801" w:history="1">
             <w:r>
               <w:rPr>
                 <w:rStyle w:val="Hyperlink"/>
                 <w:noProof/>
               </w:rPr>
-              <w:t>2.5</w:t>
+              <w:t>3.5</w:t>
             </w:r>
             <w:r>
               <w:rPr>
@@ -1194,7 +2083,7 @@
                 <w:rStyle w:val="Hyperlink"/>
                 <w:noProof/>
               </w:rPr>
-              <w:t>Prikaz aktuelnih događaja</w:t>
+              <w:t>Kreiranje sezone</w:t>
             </w:r>
             <w:r>
               <w:rPr>
@@ -1215,7 +2104,7 @@
                 <w:noProof/>
                 <w:webHidden/>
               </w:rPr>
-              <w:instrText xml:space="preserve"> PAGEREF _Toc238910172 \h </w:instrText>
+              <w:instrText xml:space="preserve"> PAGEREF _Toc238910801 \h </w:instrText>
             </w:r>
             <w:r>
               <w:rPr>
@@ -1235,7 +2124,7 @@
                 <w:noProof/>
                 <w:webHidden/>
               </w:rPr>
-              <w:t>15</w:t>
+              <w:t>25</w:t>
             </w:r>
             <w:r>
               <w:rPr>
@@ -1258,13 +2147,13 @@
               <w:noProof/>
             </w:rPr>
           </w:pPr>
-          <w:hyperlink w:anchor="_Toc238910173" w:history="1">
+          <w:hyperlink w:anchor="_Toc238910802" w:history="1">
             <w:r>
               <w:rPr>
                 <w:rStyle w:val="Hyperlink"/>
                 <w:noProof/>
               </w:rPr>
-              <w:t>2.6</w:t>
+              <w:t>3.6</w:t>
             </w:r>
             <w:r>
               <w:rPr>
@@ -1278,7 +2167,7 @@
                 <w:rStyle w:val="Hyperlink"/>
                 <w:noProof/>
               </w:rPr>
-              <w:t>Filtriranje i paginacija</w:t>
+              <w:t>Provera ispravnosti podataka</w:t>
             </w:r>
             <w:r>
               <w:rPr>
@@ -1299,7 +2188,7 @@
                 <w:noProof/>
                 <w:webHidden/>
               </w:rPr>
-              <w:instrText xml:space="preserve"> PAGEREF _Toc238910173 \h </w:instrText>
+              <w:instrText xml:space="preserve"> PAGEREF _Toc238910802 \h </w:instrText>
             </w:r>
             <w:r>
               <w:rPr>
@@ -1319,7 +2208,7 @@
                 <w:noProof/>
                 <w:webHidden/>
               </w:rPr>
-              <w:t>16</w:t>
+              <w:t>26</w:t>
             </w:r>
             <w:r>
               <w:rPr>
@@ -1342,13 +2231,13 @@
               <w:noProof/>
             </w:rPr>
           </w:pPr>
-          <w:hyperlink w:anchor="_Toc238910174" w:history="1">
+          <w:hyperlink w:anchor="_Toc238910803" w:history="1">
             <w:r>
               <w:rPr>
                 <w:rStyle w:val="Hyperlink"/>
                 <w:noProof/>
               </w:rPr>
-              <w:t>2.7</w:t>
+              <w:t>3.7</w:t>
             </w:r>
             <w:r>
               <w:rPr>
@@ -1362,7 +2251,7 @@
                 <w:rStyle w:val="Hyperlink"/>
                 <w:noProof/>
               </w:rPr>
-              <w:t>Rang lista timova</w:t>
+              <w:t>Pregled svih sezona</w:t>
             </w:r>
             <w:r>
               <w:rPr>
@@ -1383,7 +2272,7 @@
                 <w:noProof/>
                 <w:webHidden/>
               </w:rPr>
-              <w:instrText xml:space="preserve"> PAGEREF _Toc238910174 \h </w:instrText>
+              <w:instrText xml:space="preserve"> PAGEREF _Toc238910803 \h </w:instrText>
             </w:r>
             <w:r>
               <w:rPr>
@@ -1403,7 +2292,7 @@
                 <w:noProof/>
                 <w:webHidden/>
               </w:rPr>
-              <w:t>17</w:t>
+              <w:t>27</w:t>
             </w:r>
             <w:r>
               <w:rPr>
@@ -1426,13 +2315,13 @@
               <w:noProof/>
             </w:rPr>
           </w:pPr>
-          <w:hyperlink w:anchor="_Toc238910175" w:history="1">
+          <w:hyperlink w:anchor="_Toc238910804" w:history="1">
             <w:r>
               <w:rPr>
                 <w:rStyle w:val="Hyperlink"/>
                 <w:noProof/>
               </w:rPr>
-              <w:t>2.8</w:t>
+              <w:t>3.8</w:t>
             </w:r>
             <w:r>
               <w:rPr>
@@ -1446,7 +2335,7 @@
                 <w:rStyle w:val="Hyperlink"/>
                 <w:noProof/>
               </w:rPr>
-              <w:t>Obrada grešaka u JSON format</w:t>
+              <w:t>Registracija tima</w:t>
             </w:r>
             <w:r>
               <w:rPr>
@@ -1467,7 +2356,7 @@
                 <w:noProof/>
                 <w:webHidden/>
               </w:rPr>
-              <w:instrText xml:space="preserve"> PAGEREF _Toc238910175 \h </w:instrText>
+              <w:instrText xml:space="preserve"> PAGEREF _Toc238910804 \h </w:instrText>
             </w:r>
             <w:r>
               <w:rPr>
@@ -1487,7 +2376,7 @@
                 <w:noProof/>
                 <w:webHidden/>
               </w:rPr>
-              <w:t>18</w:t>
+              <w:t>28</w:t>
             </w:r>
             <w:r>
               <w:rPr>
@@ -1510,13 +2399,13 @@
               <w:noProof/>
             </w:rPr>
           </w:pPr>
-          <w:hyperlink w:anchor="_Toc238910176" w:history="1">
+          <w:hyperlink w:anchor="_Toc238910805" w:history="1">
             <w:r>
               <w:rPr>
                 <w:rStyle w:val="Hyperlink"/>
                 <w:noProof/>
               </w:rPr>
-              <w:t>2.9</w:t>
+              <w:t>3.9</w:t>
             </w:r>
             <w:r>
               <w:rPr>
@@ -1530,7 +2419,7 @@
                 <w:rStyle w:val="Hyperlink"/>
                 <w:noProof/>
               </w:rPr>
-              <w:t>Zaštita od dvostrukog unosa rezultata</w:t>
+              <w:t>Pregled timova</w:t>
             </w:r>
             <w:r>
               <w:rPr>
@@ -1551,7 +2440,7 @@
                 <w:noProof/>
                 <w:webHidden/>
               </w:rPr>
-              <w:instrText xml:space="preserve"> PAGEREF _Toc238910176 \h </w:instrText>
+              <w:instrText xml:space="preserve"> PAGEREF _Toc238910805 \h </w:instrText>
             </w:r>
             <w:r>
               <w:rPr>
@@ -1571,91 +2460,7 @@
                 <w:noProof/>
                 <w:webHidden/>
               </w:rPr>
-              <w:t>19</w:t>
-            </w:r>
-            <w:r>
-              <w:rPr>
-                <w:noProof/>
-                <w:webHidden/>
-              </w:rPr>
-              <w:fldChar w:fldCharType="end"/>
-            </w:r>
-          </w:hyperlink>
-        </w:p>
-        <w:p>
-          <w:pPr>
-            <w:pStyle w:val="TOC1"/>
-            <w:tabs>
-              <w:tab w:val="left" w:pos="440"/>
-              <w:tab w:val="right" w:leader="dot" w:pos="9350"/>
-            </w:tabs>
-            <w:rPr>
-              <w:rFonts w:asciiTheme="minorHAnsi" w:eastAsiaTheme="minorEastAsia" w:hAnsiTheme="minorHAnsi" w:cstheme="minorBidi"/>
-              <w:noProof/>
-            </w:rPr>
-          </w:pPr>
-          <w:hyperlink w:anchor="_Toc238910177" w:history="1">
-            <w:r>
-              <w:rPr>
-                <w:rStyle w:val="Hyperlink"/>
-                <w:noProof/>
-              </w:rPr>
-              <w:t>3</w:t>
-            </w:r>
-            <w:r>
-              <w:rPr>
-                <w:rFonts w:asciiTheme="minorHAnsi" w:eastAsiaTheme="minorEastAsia" w:hAnsiTheme="minorHAnsi" w:cstheme="minorBidi"/>
-                <w:noProof/>
-              </w:rPr>
-              <w:tab/>
-            </w:r>
-            <w:r>
-              <w:rPr>
-                <w:rStyle w:val="Hyperlink"/>
-                <w:noProof/>
-              </w:rPr>
-              <w:t>Korisničko uputstvo</w:t>
-            </w:r>
-            <w:r>
-              <w:rPr>
-                <w:noProof/>
-                <w:webHidden/>
-              </w:rPr>
-              <w:tab/>
-            </w:r>
-            <w:r>
-              <w:rPr>
-                <w:noProof/>
-                <w:webHidden/>
-              </w:rPr>
-              <w:fldChar w:fldCharType="begin"/>
-            </w:r>
-            <w:r>
-              <w:rPr>
-                <w:noProof/>
-                <w:webHidden/>
-              </w:rPr>
-              <w:instrText xml:space="preserve"> PAGEREF _Toc238910177 \h </w:instrText>
-            </w:r>
-            <w:r>
-              <w:rPr>
-                <w:noProof/>
-                <w:webHidden/>
-              </w:rPr>
-            </w:r>
-            <w:r>
-              <w:rPr>
-                <w:noProof/>
-                <w:webHidden/>
-              </w:rPr>
-              <w:fldChar w:fldCharType="separate"/>
-            </w:r>
-            <w:r>
-              <w:rPr>
-                <w:noProof/>
-                <w:webHidden/>
-              </w:rPr>
-              <w:t>20</w:t>
+              <w:t>29</w:t>
             </w:r>
             <w:r>
               <w:rPr>
@@ -1678,13 +2483,13 @@
               <w:noProof/>
             </w:rPr>
           </w:pPr>
-          <w:hyperlink w:anchor="_Toc238910178" w:history="1">
+          <w:hyperlink w:anchor="_Toc238910806" w:history="1">
             <w:r>
               <w:rPr>
                 <w:rStyle w:val="Hyperlink"/>
                 <w:noProof/>
               </w:rPr>
-              <w:t>3.1</w:t>
+              <w:t>3.10</w:t>
             </w:r>
             <w:r>
               <w:rPr>
@@ -1698,7 +2503,7 @@
                 <w:rStyle w:val="Hyperlink"/>
                 <w:noProof/>
               </w:rPr>
-              <w:t>Registracija korisnika</w:t>
+              <w:t>Kreiranje događaja</w:t>
             </w:r>
             <w:r>
               <w:rPr>
@@ -1719,7 +2524,7 @@
                 <w:noProof/>
                 <w:webHidden/>
               </w:rPr>
-              <w:instrText xml:space="preserve"> PAGEREF _Toc238910178 \h </w:instrText>
+              <w:instrText xml:space="preserve"> PAGEREF _Toc238910806 \h </w:instrText>
             </w:r>
             <w:r>
               <w:rPr>
@@ -1739,7 +2544,7 @@
                 <w:noProof/>
                 <w:webHidden/>
               </w:rPr>
-              <w:t>20</w:t>
+              <w:t>30</w:t>
             </w:r>
             <w:r>
               <w:rPr>
@@ -1762,13 +2567,13 @@
               <w:noProof/>
             </w:rPr>
           </w:pPr>
-          <w:hyperlink w:anchor="_Toc238910179" w:history="1">
+          <w:hyperlink w:anchor="_Toc238910807" w:history="1">
             <w:r>
               <w:rPr>
                 <w:rStyle w:val="Hyperlink"/>
                 <w:noProof/>
               </w:rPr>
-              <w:t>3.2</w:t>
+              <w:t>3.11</w:t>
             </w:r>
             <w:r>
               <w:rPr>
@@ -1782,7 +2587,7 @@
                 <w:rStyle w:val="Hyperlink"/>
                 <w:noProof/>
               </w:rPr>
-              <w:t>Prijava korisnika</w:t>
+              <w:t>Prikaz aktuelnih događaja</w:t>
             </w:r>
             <w:r>
               <w:rPr>
@@ -1803,7 +2608,7 @@
                 <w:noProof/>
                 <w:webHidden/>
               </w:rPr>
-              <w:instrText xml:space="preserve"> PAGEREF _Toc238910179 \h </w:instrText>
+              <w:instrText xml:space="preserve"> PAGEREF _Toc238910807 \h </w:instrText>
             </w:r>
             <w:r>
               <w:rPr>
@@ -1823,7 +2628,7 @@
                 <w:noProof/>
                 <w:webHidden/>
               </w:rPr>
-              <w:t>21</w:t>
+              <w:t>31</w:t>
             </w:r>
             <w:r>
               <w:rPr>
@@ -1846,14 +2651,13 @@
               <w:noProof/>
             </w:rPr>
           </w:pPr>
-          <w:hyperlink w:anchor="_Toc238910180" w:history="1">
+          <w:hyperlink w:anchor="_Toc238910808" w:history="1">
             <w:r>
               <w:rPr>
                 <w:rStyle w:val="Hyperlink"/>
                 <w:noProof/>
-                <w:lang w:val="fr-FR"/>
-              </w:rPr>
-              <w:t>3.3</w:t>
+              </w:rPr>
+              <w:t>3.12</w:t>
             </w:r>
             <w:r>
               <w:rPr>
@@ -1866,9 +2670,8 @@
               <w:rPr>
                 <w:rStyle w:val="Hyperlink"/>
                 <w:noProof/>
-                <w:lang w:val="fr-FR"/>
-              </w:rPr>
-              <w:t>Pristup zaštićenoj ruti sa tokenom</w:t>
+              </w:rPr>
+              <w:t>Upis rezultata</w:t>
             </w:r>
             <w:r>
               <w:rPr>
@@ -1889,7 +2692,7 @@
                 <w:noProof/>
                 <w:webHidden/>
               </w:rPr>
-              <w:instrText xml:space="preserve"> PAGEREF _Toc238910180 \h </w:instrText>
+              <w:instrText xml:space="preserve"> PAGEREF _Toc238910808 \h </w:instrText>
             </w:r>
             <w:r>
               <w:rPr>
@@ -1909,7 +2712,7 @@
                 <w:noProof/>
                 <w:webHidden/>
               </w:rPr>
-              <w:t>22</w:t>
+              <w:t>32</w:t>
             </w:r>
             <w:r>
               <w:rPr>
@@ -1932,13 +2735,13 @@
               <w:noProof/>
             </w:rPr>
           </w:pPr>
-          <w:hyperlink w:anchor="_Toc238910181" w:history="1">
+          <w:hyperlink w:anchor="_Toc238910809" w:history="1">
             <w:r>
               <w:rPr>
                 <w:rStyle w:val="Hyperlink"/>
                 <w:noProof/>
               </w:rPr>
-              <w:t>3.4</w:t>
+              <w:t>3.13</w:t>
             </w:r>
             <w:r>
               <w:rPr>
@@ -1952,7 +2755,7 @@
                 <w:rStyle w:val="Hyperlink"/>
                 <w:noProof/>
               </w:rPr>
-              <w:t>Pristup zaštićenoj ruti bez tokena</w:t>
+              <w:t>Sprečavanje dvostrukog unosa</w:t>
             </w:r>
             <w:r>
               <w:rPr>
@@ -1973,7 +2776,7 @@
                 <w:noProof/>
                 <w:webHidden/>
               </w:rPr>
-              <w:instrText xml:space="preserve"> PAGEREF _Toc238910181 \h </w:instrText>
+              <w:instrText xml:space="preserve"> PAGEREF _Toc238910809 \h </w:instrText>
             </w:r>
             <w:r>
               <w:rPr>
@@ -1993,7 +2796,7 @@
                 <w:noProof/>
                 <w:webHidden/>
               </w:rPr>
-              <w:t>23</w:t>
+              <w:t>33</w:t>
             </w:r>
             <w:r>
               <w:rPr>
@@ -2016,13 +2819,13 @@
               <w:noProof/>
             </w:rPr>
           </w:pPr>
-          <w:hyperlink w:anchor="_Toc238910182" w:history="1">
+          <w:hyperlink w:anchor="_Toc238910810" w:history="1">
             <w:r>
               <w:rPr>
                 <w:rStyle w:val="Hyperlink"/>
                 <w:noProof/>
               </w:rPr>
-              <w:t>3.5</w:t>
+              <w:t>3.14</w:t>
             </w:r>
             <w:r>
               <w:rPr>
@@ -2036,7 +2839,7 @@
                 <w:rStyle w:val="Hyperlink"/>
                 <w:noProof/>
               </w:rPr>
-              <w:t>Kreiranje sezone</w:t>
+              <w:t>Rang lista timova</w:t>
             </w:r>
             <w:r>
               <w:rPr>
@@ -2057,7 +2860,7 @@
                 <w:noProof/>
                 <w:webHidden/>
               </w:rPr>
-              <w:instrText xml:space="preserve"> PAGEREF _Toc238910182 \h </w:instrText>
+              <w:instrText xml:space="preserve"> PAGEREF _Toc238910810 \h </w:instrText>
             </w:r>
             <w:r>
               <w:rPr>
@@ -2077,7 +2880,7 @@
                 <w:noProof/>
                 <w:webHidden/>
               </w:rPr>
-              <w:t>24</w:t>
+              <w:t>34</w:t>
             </w:r>
             <w:r>
               <w:rPr>
@@ -2100,13 +2903,13 @@
               <w:noProof/>
             </w:rPr>
           </w:pPr>
-          <w:hyperlink w:anchor="_Toc238910183" w:history="1">
+          <w:hyperlink w:anchor="_Toc238910811" w:history="1">
             <w:r>
               <w:rPr>
                 <w:rStyle w:val="Hyperlink"/>
                 <w:noProof/>
               </w:rPr>
-              <w:t>3.6</w:t>
+              <w:t>3.15</w:t>
             </w:r>
             <w:r>
               <w:rPr>
@@ -2120,7 +2923,7 @@
                 <w:rStyle w:val="Hyperlink"/>
                 <w:noProof/>
               </w:rPr>
-              <w:t>Provera ispravnosti podataka</w:t>
+              <w:t>Filtriranje i paginacija</w:t>
             </w:r>
             <w:r>
               <w:rPr>
@@ -2141,7 +2944,7 @@
                 <w:noProof/>
                 <w:webHidden/>
               </w:rPr>
-              <w:instrText xml:space="preserve"> PAGEREF _Toc238910183 \h </w:instrText>
+              <w:instrText xml:space="preserve"> PAGEREF _Toc238910811 \h </w:instrText>
             </w:r>
             <w:r>
               <w:rPr>
@@ -2161,7 +2964,7 @@
                 <w:noProof/>
                 <w:webHidden/>
               </w:rPr>
-              <w:t>25</w:t>
+              <w:t>35</w:t>
             </w:r>
             <w:r>
               <w:rPr>
@@ -2184,13 +2987,13 @@
               <w:noProof/>
             </w:rPr>
           </w:pPr>
-          <w:hyperlink w:anchor="_Toc238910184" w:history="1">
+          <w:hyperlink w:anchor="_Toc238910812" w:history="1">
             <w:r>
               <w:rPr>
                 <w:rStyle w:val="Hyperlink"/>
                 <w:noProof/>
               </w:rPr>
-              <w:t>3.7</w:t>
+              <w:t>3.16</w:t>
             </w:r>
             <w:r>
               <w:rPr>
@@ -2204,7 +3007,7 @@
                 <w:rStyle w:val="Hyperlink"/>
                 <w:noProof/>
               </w:rPr>
-              <w:t>Pregled svih sezona</w:t>
+              <w:t>Odjava korisnika</w:t>
             </w:r>
             <w:r>
               <w:rPr>
@@ -2225,7 +3028,7 @@
                 <w:noProof/>
                 <w:webHidden/>
               </w:rPr>
-              <w:instrText xml:space="preserve"> PAGEREF _Toc238910184 \h </w:instrText>
+              <w:instrText xml:space="preserve"> PAGEREF _Toc238910812 \h </w:instrText>
             </w:r>
             <w:r>
               <w:rPr>
@@ -2245,7 +3048,7 @@
                 <w:noProof/>
                 <w:webHidden/>
               </w:rPr>
-              <w:t>26</w:t>
+              <w:t>36</w:t>
             </w:r>
             <w:r>
               <w:rPr>
@@ -2268,13 +3071,13 @@
               <w:noProof/>
             </w:rPr>
           </w:pPr>
-          <w:hyperlink w:anchor="_Toc238910185" w:history="1">
+          <w:hyperlink w:anchor="_Toc238910813" w:history="1">
             <w:r>
               <w:rPr>
                 <w:rStyle w:val="Hyperlink"/>
                 <w:noProof/>
               </w:rPr>
-              <w:t>3.8</w:t>
+              <w:t>3.17</w:t>
             </w:r>
             <w:r>
               <w:rPr>
@@ -2288,7 +3091,7 @@
                 <w:rStyle w:val="Hyperlink"/>
                 <w:noProof/>
               </w:rPr>
-              <w:t>Registracija tima</w:t>
+              <w:t>Provera nevažećeg tokena</w:t>
             </w:r>
             <w:r>
               <w:rPr>
@@ -2309,7 +3112,7 @@
                 <w:noProof/>
                 <w:webHidden/>
               </w:rPr>
-              <w:instrText xml:space="preserve"> PAGEREF _Toc238910185 \h </w:instrText>
+              <w:instrText xml:space="preserve"> PAGEREF _Toc238910813 \h </w:instrText>
             </w:r>
             <w:r>
               <w:rPr>
@@ -2329,763 +3132,7 @@
                 <w:noProof/>
                 <w:webHidden/>
               </w:rPr>
-              <w:t>27</w:t>
-            </w:r>
-            <w:r>
-              <w:rPr>
-                <w:noProof/>
-                <w:webHidden/>
-              </w:rPr>
-              <w:fldChar w:fldCharType="end"/>
-            </w:r>
-          </w:hyperlink>
-        </w:p>
-        <w:p>
-          <w:pPr>
-            <w:pStyle w:val="TOC2"/>
-            <w:tabs>
-              <w:tab w:val="left" w:pos="880"/>
-              <w:tab w:val="right" w:leader="dot" w:pos="9350"/>
-            </w:tabs>
-            <w:rPr>
-              <w:rFonts w:asciiTheme="minorHAnsi" w:eastAsiaTheme="minorEastAsia" w:hAnsiTheme="minorHAnsi" w:cstheme="minorBidi"/>
-              <w:noProof/>
-            </w:rPr>
-          </w:pPr>
-          <w:hyperlink w:anchor="_Toc238910186" w:history="1">
-            <w:r>
-              <w:rPr>
-                <w:rStyle w:val="Hyperlink"/>
-                <w:noProof/>
-              </w:rPr>
-              <w:t>3.9</w:t>
-            </w:r>
-            <w:r>
-              <w:rPr>
-                <w:rFonts w:asciiTheme="minorHAnsi" w:eastAsiaTheme="minorEastAsia" w:hAnsiTheme="minorHAnsi" w:cstheme="minorBidi"/>
-                <w:noProof/>
-              </w:rPr>
-              <w:tab/>
-            </w:r>
-            <w:r>
-              <w:rPr>
-                <w:rStyle w:val="Hyperlink"/>
-                <w:noProof/>
-              </w:rPr>
-              <w:t>Pregled timova</w:t>
-            </w:r>
-            <w:r>
-              <w:rPr>
-                <w:noProof/>
-                <w:webHidden/>
-              </w:rPr>
-              <w:tab/>
-            </w:r>
-            <w:r>
-              <w:rPr>
-                <w:noProof/>
-                <w:webHidden/>
-              </w:rPr>
-              <w:fldChar w:fldCharType="begin"/>
-            </w:r>
-            <w:r>
-              <w:rPr>
-                <w:noProof/>
-                <w:webHidden/>
-              </w:rPr>
-              <w:instrText xml:space="preserve"> PAGEREF _Toc238910186 \h </w:instrText>
-            </w:r>
-            <w:r>
-              <w:rPr>
-                <w:noProof/>
-                <w:webHidden/>
-              </w:rPr>
-            </w:r>
-            <w:r>
-              <w:rPr>
-                <w:noProof/>
-                <w:webHidden/>
-              </w:rPr>
-              <w:fldChar w:fldCharType="separate"/>
-            </w:r>
-            <w:r>
-              <w:rPr>
-                <w:noProof/>
-                <w:webHidden/>
-              </w:rPr>
-              <w:t>28</w:t>
-            </w:r>
-            <w:r>
-              <w:rPr>
-                <w:noProof/>
-                <w:webHidden/>
-              </w:rPr>
-              <w:fldChar w:fldCharType="end"/>
-            </w:r>
-          </w:hyperlink>
-        </w:p>
-        <w:p>
-          <w:pPr>
-            <w:pStyle w:val="TOC2"/>
-            <w:tabs>
-              <w:tab w:val="left" w:pos="880"/>
-              <w:tab w:val="right" w:leader="dot" w:pos="9350"/>
-            </w:tabs>
-            <w:rPr>
-              <w:rFonts w:asciiTheme="minorHAnsi" w:eastAsiaTheme="minorEastAsia" w:hAnsiTheme="minorHAnsi" w:cstheme="minorBidi"/>
-              <w:noProof/>
-            </w:rPr>
-          </w:pPr>
-          <w:hyperlink w:anchor="_Toc238910187" w:history="1">
-            <w:r>
-              <w:rPr>
-                <w:rStyle w:val="Hyperlink"/>
-                <w:noProof/>
-              </w:rPr>
-              <w:t>3.10</w:t>
-            </w:r>
-            <w:r>
-              <w:rPr>
-                <w:rFonts w:asciiTheme="minorHAnsi" w:eastAsiaTheme="minorEastAsia" w:hAnsiTheme="minorHAnsi" w:cstheme="minorBidi"/>
-                <w:noProof/>
-              </w:rPr>
-              <w:tab/>
-            </w:r>
-            <w:r>
-              <w:rPr>
-                <w:rStyle w:val="Hyperlink"/>
-                <w:noProof/>
-              </w:rPr>
-              <w:t>Kreiranje događaja</w:t>
-            </w:r>
-            <w:r>
-              <w:rPr>
-                <w:noProof/>
-                <w:webHidden/>
-              </w:rPr>
-              <w:tab/>
-            </w:r>
-            <w:r>
-              <w:rPr>
-                <w:noProof/>
-                <w:webHidden/>
-              </w:rPr>
-              <w:fldChar w:fldCharType="begin"/>
-            </w:r>
-            <w:r>
-              <w:rPr>
-                <w:noProof/>
-                <w:webHidden/>
-              </w:rPr>
-              <w:instrText xml:space="preserve"> PAGEREF _Toc238910187 \h </w:instrText>
-            </w:r>
-            <w:r>
-              <w:rPr>
-                <w:noProof/>
-                <w:webHidden/>
-              </w:rPr>
-            </w:r>
-            <w:r>
-              <w:rPr>
-                <w:noProof/>
-                <w:webHidden/>
-              </w:rPr>
-              <w:fldChar w:fldCharType="separate"/>
-            </w:r>
-            <w:r>
-              <w:rPr>
-                <w:noProof/>
-                <w:webHidden/>
-              </w:rPr>
-              <w:t>29</w:t>
-            </w:r>
-            <w:r>
-              <w:rPr>
-                <w:noProof/>
-                <w:webHidden/>
-              </w:rPr>
-              <w:fldChar w:fldCharType="end"/>
-            </w:r>
-          </w:hyperlink>
-        </w:p>
-        <w:p>
-          <w:pPr>
-            <w:pStyle w:val="TOC2"/>
-            <w:tabs>
-              <w:tab w:val="left" w:pos="880"/>
-              <w:tab w:val="right" w:leader="dot" w:pos="9350"/>
-            </w:tabs>
-            <w:rPr>
-              <w:rFonts w:asciiTheme="minorHAnsi" w:eastAsiaTheme="minorEastAsia" w:hAnsiTheme="minorHAnsi" w:cstheme="minorBidi"/>
-              <w:noProof/>
-            </w:rPr>
-          </w:pPr>
-          <w:hyperlink w:anchor="_Toc238910188" w:history="1">
-            <w:r>
-              <w:rPr>
-                <w:rStyle w:val="Hyperlink"/>
-                <w:noProof/>
-              </w:rPr>
-              <w:t>3.11</w:t>
-            </w:r>
-            <w:r>
-              <w:rPr>
-                <w:rFonts w:asciiTheme="minorHAnsi" w:eastAsiaTheme="minorEastAsia" w:hAnsiTheme="minorHAnsi" w:cstheme="minorBidi"/>
-                <w:noProof/>
-              </w:rPr>
-              <w:tab/>
-            </w:r>
-            <w:r>
-              <w:rPr>
-                <w:rStyle w:val="Hyperlink"/>
-                <w:noProof/>
-              </w:rPr>
-              <w:t>Prikaz aktuelnih događaja</w:t>
-            </w:r>
-            <w:r>
-              <w:rPr>
-                <w:noProof/>
-                <w:webHidden/>
-              </w:rPr>
-              <w:tab/>
-            </w:r>
-            <w:r>
-              <w:rPr>
-                <w:noProof/>
-                <w:webHidden/>
-              </w:rPr>
-              <w:fldChar w:fldCharType="begin"/>
-            </w:r>
-            <w:r>
-              <w:rPr>
-                <w:noProof/>
-                <w:webHidden/>
-              </w:rPr>
-              <w:instrText xml:space="preserve"> PAGEREF _Toc238910188 \h </w:instrText>
-            </w:r>
-            <w:r>
-              <w:rPr>
-                <w:noProof/>
-                <w:webHidden/>
-              </w:rPr>
-            </w:r>
-            <w:r>
-              <w:rPr>
-                <w:noProof/>
-                <w:webHidden/>
-              </w:rPr>
-              <w:fldChar w:fldCharType="separate"/>
-            </w:r>
-            <w:r>
-              <w:rPr>
-                <w:noProof/>
-                <w:webHidden/>
-              </w:rPr>
-              <w:t>30</w:t>
-            </w:r>
-            <w:r>
-              <w:rPr>
-                <w:noProof/>
-                <w:webHidden/>
-              </w:rPr>
-              <w:fldChar w:fldCharType="end"/>
-            </w:r>
-          </w:hyperlink>
-        </w:p>
-        <w:p>
-          <w:pPr>
-            <w:pStyle w:val="TOC2"/>
-            <w:tabs>
-              <w:tab w:val="left" w:pos="880"/>
-              <w:tab w:val="right" w:leader="dot" w:pos="9350"/>
-            </w:tabs>
-            <w:rPr>
-              <w:rFonts w:asciiTheme="minorHAnsi" w:eastAsiaTheme="minorEastAsia" w:hAnsiTheme="minorHAnsi" w:cstheme="minorBidi"/>
-              <w:noProof/>
-            </w:rPr>
-          </w:pPr>
-          <w:hyperlink w:anchor="_Toc238910189" w:history="1">
-            <w:r>
-              <w:rPr>
-                <w:rStyle w:val="Hyperlink"/>
-                <w:noProof/>
-              </w:rPr>
-              <w:t>3.12</w:t>
-            </w:r>
-            <w:r>
-              <w:rPr>
-                <w:rFonts w:asciiTheme="minorHAnsi" w:eastAsiaTheme="minorEastAsia" w:hAnsiTheme="minorHAnsi" w:cstheme="minorBidi"/>
-                <w:noProof/>
-              </w:rPr>
-              <w:tab/>
-            </w:r>
-            <w:r>
-              <w:rPr>
-                <w:rStyle w:val="Hyperlink"/>
-                <w:noProof/>
-              </w:rPr>
-              <w:t>Upis rezultata</w:t>
-            </w:r>
-            <w:r>
-              <w:rPr>
-                <w:noProof/>
-                <w:webHidden/>
-              </w:rPr>
-              <w:tab/>
-            </w:r>
-            <w:r>
-              <w:rPr>
-                <w:noProof/>
-                <w:webHidden/>
-              </w:rPr>
-              <w:fldChar w:fldCharType="begin"/>
-            </w:r>
-            <w:r>
-              <w:rPr>
-                <w:noProof/>
-                <w:webHidden/>
-              </w:rPr>
-              <w:instrText xml:space="preserve"> PAGEREF _Toc238910189 \h </w:instrText>
-            </w:r>
-            <w:r>
-              <w:rPr>
-                <w:noProof/>
-                <w:webHidden/>
-              </w:rPr>
-            </w:r>
-            <w:r>
-              <w:rPr>
-                <w:noProof/>
-                <w:webHidden/>
-              </w:rPr>
-              <w:fldChar w:fldCharType="separate"/>
-            </w:r>
-            <w:r>
-              <w:rPr>
-                <w:noProof/>
-                <w:webHidden/>
-              </w:rPr>
-              <w:t>31</w:t>
-            </w:r>
-            <w:r>
-              <w:rPr>
-                <w:noProof/>
-                <w:webHidden/>
-              </w:rPr>
-              <w:fldChar w:fldCharType="end"/>
-            </w:r>
-          </w:hyperlink>
-        </w:p>
-        <w:p>
-          <w:pPr>
-            <w:pStyle w:val="TOC2"/>
-            <w:tabs>
-              <w:tab w:val="left" w:pos="880"/>
-              <w:tab w:val="right" w:leader="dot" w:pos="9350"/>
-            </w:tabs>
-            <w:rPr>
-              <w:rFonts w:asciiTheme="minorHAnsi" w:eastAsiaTheme="minorEastAsia" w:hAnsiTheme="minorHAnsi" w:cstheme="minorBidi"/>
-              <w:noProof/>
-            </w:rPr>
-          </w:pPr>
-          <w:hyperlink w:anchor="_Toc238910190" w:history="1">
-            <w:r>
-              <w:rPr>
-                <w:rStyle w:val="Hyperlink"/>
-                <w:noProof/>
-              </w:rPr>
-              <w:t>3.13</w:t>
-            </w:r>
-            <w:r>
-              <w:rPr>
-                <w:rFonts w:asciiTheme="minorHAnsi" w:eastAsiaTheme="minorEastAsia" w:hAnsiTheme="minorHAnsi" w:cstheme="minorBidi"/>
-                <w:noProof/>
-              </w:rPr>
-              <w:tab/>
-            </w:r>
-            <w:r>
-              <w:rPr>
-                <w:rStyle w:val="Hyperlink"/>
-                <w:noProof/>
-              </w:rPr>
-              <w:t>Sprečavanje dvostrukog unosa</w:t>
-            </w:r>
-            <w:r>
-              <w:rPr>
-                <w:noProof/>
-                <w:webHidden/>
-              </w:rPr>
-              <w:tab/>
-            </w:r>
-            <w:r>
-              <w:rPr>
-                <w:noProof/>
-                <w:webHidden/>
-              </w:rPr>
-              <w:fldChar w:fldCharType="begin"/>
-            </w:r>
-            <w:r>
-              <w:rPr>
-                <w:noProof/>
-                <w:webHidden/>
-              </w:rPr>
-              <w:instrText xml:space="preserve"> PAGEREF _Toc238910190 \h </w:instrText>
-            </w:r>
-            <w:r>
-              <w:rPr>
-                <w:noProof/>
-                <w:webHidden/>
-              </w:rPr>
-            </w:r>
-            <w:r>
-              <w:rPr>
-                <w:noProof/>
-                <w:webHidden/>
-              </w:rPr>
-              <w:fldChar w:fldCharType="separate"/>
-            </w:r>
-            <w:r>
-              <w:rPr>
-                <w:noProof/>
-                <w:webHidden/>
-              </w:rPr>
-              <w:t>32</w:t>
-            </w:r>
-            <w:r>
-              <w:rPr>
-                <w:noProof/>
-                <w:webHidden/>
-              </w:rPr>
-              <w:fldChar w:fldCharType="end"/>
-            </w:r>
-          </w:hyperlink>
-        </w:p>
-        <w:p>
-          <w:pPr>
-            <w:pStyle w:val="TOC2"/>
-            <w:tabs>
-              <w:tab w:val="left" w:pos="880"/>
-              <w:tab w:val="right" w:leader="dot" w:pos="9350"/>
-            </w:tabs>
-            <w:rPr>
-              <w:rFonts w:asciiTheme="minorHAnsi" w:eastAsiaTheme="minorEastAsia" w:hAnsiTheme="minorHAnsi" w:cstheme="minorBidi"/>
-              <w:noProof/>
-            </w:rPr>
-          </w:pPr>
-          <w:hyperlink w:anchor="_Toc238910191" w:history="1">
-            <w:r>
-              <w:rPr>
-                <w:rStyle w:val="Hyperlink"/>
-                <w:noProof/>
-              </w:rPr>
-              <w:t>3.14</w:t>
-            </w:r>
-            <w:r>
-              <w:rPr>
-                <w:rFonts w:asciiTheme="minorHAnsi" w:eastAsiaTheme="minorEastAsia" w:hAnsiTheme="minorHAnsi" w:cstheme="minorBidi"/>
-                <w:noProof/>
-              </w:rPr>
-              <w:tab/>
-            </w:r>
-            <w:r>
-              <w:rPr>
-                <w:rStyle w:val="Hyperlink"/>
-                <w:noProof/>
-              </w:rPr>
-              <w:t>Rang lista timova</w:t>
-            </w:r>
-            <w:r>
-              <w:rPr>
-                <w:noProof/>
-                <w:webHidden/>
-              </w:rPr>
-              <w:tab/>
-            </w:r>
-            <w:r>
-              <w:rPr>
-                <w:noProof/>
-                <w:webHidden/>
-              </w:rPr>
-              <w:fldChar w:fldCharType="begin"/>
-            </w:r>
-            <w:r>
-              <w:rPr>
-                <w:noProof/>
-                <w:webHidden/>
-              </w:rPr>
-              <w:instrText xml:space="preserve"> PAGEREF _Toc238910191 \h </w:instrText>
-            </w:r>
-            <w:r>
-              <w:rPr>
-                <w:noProof/>
-                <w:webHidden/>
-              </w:rPr>
-            </w:r>
-            <w:r>
-              <w:rPr>
-                <w:noProof/>
-                <w:webHidden/>
-              </w:rPr>
-              <w:fldChar w:fldCharType="separate"/>
-            </w:r>
-            <w:r>
-              <w:rPr>
-                <w:noProof/>
-                <w:webHidden/>
-              </w:rPr>
-              <w:t>33</w:t>
-            </w:r>
-            <w:r>
-              <w:rPr>
-                <w:noProof/>
-                <w:webHidden/>
-              </w:rPr>
-              <w:fldChar w:fldCharType="end"/>
-            </w:r>
-          </w:hyperlink>
-        </w:p>
-        <w:p>
-          <w:pPr>
-            <w:pStyle w:val="TOC2"/>
-            <w:tabs>
-              <w:tab w:val="left" w:pos="880"/>
-              <w:tab w:val="right" w:leader="dot" w:pos="9350"/>
-            </w:tabs>
-            <w:rPr>
-              <w:rFonts w:asciiTheme="minorHAnsi" w:eastAsiaTheme="minorEastAsia" w:hAnsiTheme="minorHAnsi" w:cstheme="minorBidi"/>
-              <w:noProof/>
-            </w:rPr>
-          </w:pPr>
-          <w:hyperlink w:anchor="_Toc238910192" w:history="1">
-            <w:r>
-              <w:rPr>
-                <w:rStyle w:val="Hyperlink"/>
-                <w:noProof/>
-              </w:rPr>
-              <w:t>3.15</w:t>
-            </w:r>
-            <w:r>
-              <w:rPr>
-                <w:rFonts w:asciiTheme="minorHAnsi" w:eastAsiaTheme="minorEastAsia" w:hAnsiTheme="minorHAnsi" w:cstheme="minorBidi"/>
-                <w:noProof/>
-              </w:rPr>
-              <w:tab/>
-            </w:r>
-            <w:r>
-              <w:rPr>
-                <w:rStyle w:val="Hyperlink"/>
-                <w:noProof/>
-              </w:rPr>
-              <w:t>Filtriranje i paginacija</w:t>
-            </w:r>
-            <w:r>
-              <w:rPr>
-                <w:noProof/>
-                <w:webHidden/>
-              </w:rPr>
-              <w:tab/>
-            </w:r>
-            <w:r>
-              <w:rPr>
-                <w:noProof/>
-                <w:webHidden/>
-              </w:rPr>
-              <w:fldChar w:fldCharType="begin"/>
-            </w:r>
-            <w:r>
-              <w:rPr>
-                <w:noProof/>
-                <w:webHidden/>
-              </w:rPr>
-              <w:instrText xml:space="preserve"> PAGEREF _Toc238910192 \h </w:instrText>
-            </w:r>
-            <w:r>
-              <w:rPr>
-                <w:noProof/>
-                <w:webHidden/>
-              </w:rPr>
-            </w:r>
-            <w:r>
-              <w:rPr>
-                <w:noProof/>
-                <w:webHidden/>
-              </w:rPr>
-              <w:fldChar w:fldCharType="separate"/>
-            </w:r>
-            <w:r>
-              <w:rPr>
-                <w:noProof/>
-                <w:webHidden/>
-              </w:rPr>
-              <w:t>34</w:t>
-            </w:r>
-            <w:r>
-              <w:rPr>
-                <w:noProof/>
-                <w:webHidden/>
-              </w:rPr>
-              <w:fldChar w:fldCharType="end"/>
-            </w:r>
-          </w:hyperlink>
-        </w:p>
-        <w:p>
-          <w:pPr>
-            <w:pStyle w:val="TOC2"/>
-            <w:tabs>
-              <w:tab w:val="left" w:pos="880"/>
-              <w:tab w:val="right" w:leader="dot" w:pos="9350"/>
-            </w:tabs>
-            <w:rPr>
-              <w:rFonts w:asciiTheme="minorHAnsi" w:eastAsiaTheme="minorEastAsia" w:hAnsiTheme="minorHAnsi" w:cstheme="minorBidi"/>
-              <w:noProof/>
-            </w:rPr>
-          </w:pPr>
-          <w:hyperlink w:anchor="_Toc238910193" w:history="1">
-            <w:r>
-              <w:rPr>
-                <w:rStyle w:val="Hyperlink"/>
-                <w:noProof/>
-              </w:rPr>
-              <w:t>3.16</w:t>
-            </w:r>
-            <w:r>
-              <w:rPr>
-                <w:rFonts w:asciiTheme="minorHAnsi" w:eastAsiaTheme="minorEastAsia" w:hAnsiTheme="minorHAnsi" w:cstheme="minorBidi"/>
-                <w:noProof/>
-              </w:rPr>
-              <w:tab/>
-            </w:r>
-            <w:r>
-              <w:rPr>
-                <w:rStyle w:val="Hyperlink"/>
-                <w:noProof/>
-              </w:rPr>
-              <w:t>Odjava korisnika</w:t>
-            </w:r>
-            <w:r>
-              <w:rPr>
-                <w:noProof/>
-                <w:webHidden/>
-              </w:rPr>
-              <w:tab/>
-            </w:r>
-            <w:r>
-              <w:rPr>
-                <w:noProof/>
-                <w:webHidden/>
-              </w:rPr>
-              <w:fldChar w:fldCharType="begin"/>
-            </w:r>
-            <w:r>
-              <w:rPr>
-                <w:noProof/>
-                <w:webHidden/>
-              </w:rPr>
-              <w:instrText xml:space="preserve"> PAGEREF _Toc238910193 \h </w:instrText>
-            </w:r>
-            <w:r>
-              <w:rPr>
-                <w:noProof/>
-                <w:webHidden/>
-              </w:rPr>
-            </w:r>
-            <w:r>
-              <w:rPr>
-                <w:noProof/>
-                <w:webHidden/>
-              </w:rPr>
-              <w:fldChar w:fldCharType="separate"/>
-            </w:r>
-            <w:r>
-              <w:rPr>
-                <w:noProof/>
-                <w:webHidden/>
-              </w:rPr>
-              <w:t>35</w:t>
-            </w:r>
-            <w:r>
-              <w:rPr>
-                <w:noProof/>
-                <w:webHidden/>
-              </w:rPr>
-              <w:fldChar w:fldCharType="end"/>
-            </w:r>
-          </w:hyperlink>
-        </w:p>
-        <w:p>
-          <w:pPr>
-            <w:pStyle w:val="TOC2"/>
-            <w:tabs>
-              <w:tab w:val="left" w:pos="880"/>
-              <w:tab w:val="right" w:leader="dot" w:pos="9350"/>
-            </w:tabs>
-            <w:rPr>
-              <w:rFonts w:asciiTheme="minorHAnsi" w:eastAsiaTheme="minorEastAsia" w:hAnsiTheme="minorHAnsi" w:cstheme="minorBidi"/>
-              <w:noProof/>
-            </w:rPr>
-          </w:pPr>
-          <w:hyperlink w:anchor="_Toc238910194" w:history="1">
-            <w:r>
-              <w:rPr>
-                <w:rStyle w:val="Hyperlink"/>
-                <w:noProof/>
-              </w:rPr>
-              <w:t>3.17</w:t>
-            </w:r>
-            <w:r>
-              <w:rPr>
-                <w:rFonts w:asciiTheme="minorHAnsi" w:eastAsiaTheme="minorEastAsia" w:hAnsiTheme="minorHAnsi" w:cstheme="minorBidi"/>
-                <w:noProof/>
-              </w:rPr>
-              <w:tab/>
-            </w:r>
-            <w:r>
-              <w:rPr>
-                <w:rStyle w:val="Hyperlink"/>
-                <w:noProof/>
-              </w:rPr>
-              <w:t>Provera nevažećeg tokena</w:t>
-            </w:r>
-            <w:r>
-              <w:rPr>
-                <w:noProof/>
-                <w:webHidden/>
-              </w:rPr>
-              <w:tab/>
-            </w:r>
-            <w:r>
-              <w:rPr>
-                <w:noProof/>
-                <w:webHidden/>
-              </w:rPr>
-              <w:fldChar w:fldCharType="begin"/>
-            </w:r>
-            <w:r>
-              <w:rPr>
-                <w:noProof/>
-                <w:webHidden/>
-              </w:rPr>
-              <w:instrText xml:space="preserve"> PAGEREF _Toc238910194 \h </w:instrText>
-            </w:r>
-            <w:r>
-              <w:rPr>
-                <w:noProof/>
-                <w:webHidden/>
-              </w:rPr>
-            </w:r>
-            <w:r>
-              <w:rPr>
-                <w:noProof/>
-                <w:webHidden/>
-              </w:rPr>
-              <w:fldChar w:fldCharType="separate"/>
-            </w:r>
-            <w:r>
-              <w:rPr>
-                <w:noProof/>
-                <w:webHidden/>
-              </w:rPr>
-              <w:t>36</w:t>
+              <w:t>37</w:t>
             </w:r>
             <w:r>
               <w:rPr>
@@ -3123,7 +3170,7 @@
       <w:pPr>
         <w:pStyle w:val="Heading1"/>
       </w:pPr>
-      <w:bookmarkStart w:id="0" w:name="_Toc238910161"/>
+      <w:bookmarkStart w:id="1" w:name="_Toc238910780"/>
       <w:r>
         <w:lastRenderedPageBreak/>
         <w:t>Tema seminarskog rada i k</w:t>
@@ -3131,22 +3178,45 @@
       <w:r>
         <w:t>orisnički zahtev</w:t>
       </w:r>
-      <w:bookmarkEnd w:id="0"/>
+      <w:bookmarkEnd w:id="1"/>
     </w:p>
     <w:p>
       <w:pPr>
         <w:pStyle w:val="Heading2"/>
       </w:pPr>
-      <w:bookmarkStart w:id="1" w:name="_Toc238910162"/>
+      <w:bookmarkStart w:id="2" w:name="_Toc238910781"/>
       <w:r>
         <w:t>Tema rada</w:t>
       </w:r>
-      <w:bookmarkEnd w:id="1"/>
-    </w:p>
-    <w:p>
-      <w:proofErr w:type="gramStart"/>
-      <w:r>
-        <w:t>Tema rada je veb aplikacija za praćenje pub kviza.</w:t>
+      <w:bookmarkEnd w:id="2"/>
+    </w:p>
+    <w:p>
+      <w:pPr>
+        <w:rPr>
+          <w:lang w:val="fr-FR"/>
+        </w:rPr>
+      </w:pPr>
+      <w:r>
+        <w:rPr>
+          <w:lang w:val="fr-FR"/>
+        </w:rPr>
+        <w:t>Tema rada je veb aplikacija za praćenje pub kviza. Aplikacija je realizovana kao serverska REST API aplikacija u okviru Laravel radnog okvira, bez korisničkog interfejsa, a testirana je kroz alat Postman. Podaci se razmenjuju isključivo u JSON formatu, što omogućava da se na ovaj sistem kasnije poveže bilo koji klijent — veb stranica, mobilna aplikacija ili prikaz na ekranu u samom lokalu.</w:t>
+      </w:r>
+    </w:p>
+    <w:p>
+      <w:pPr>
+        <w:pStyle w:val="Heading2"/>
+      </w:pPr>
+      <w:bookmarkStart w:id="3" w:name="_Toc238910782"/>
+      <w:r>
+        <w:t>Opis problema</w:t>
+      </w:r>
+      <w:bookmarkEnd w:id="3"/>
+    </w:p>
+    <w:p>
+      <w:proofErr w:type="gramStart"/>
+      <w:r>
+        <w:t>Pub kviz je takmičenje koje se održava u ugostiteljskim objektima, obično jednom nedeljno, tokom sezone koja traje nekoliko meseci.</w:t>
       </w:r>
       <w:proofErr w:type="gramEnd"/>
       <w:r>
@@ -3154,11 +3224,46 @@
       </w:r>
       <w:proofErr w:type="gramStart"/>
       <w:r>
-        <w:t>Aplikacija je realizovana kao serverska REST API aplikacija u okviru Laravel radnog okvira, bez korisničkog interfejsa, a testirana je kroz alat Postman.</w:t>
-      </w:r>
-      <w:proofErr w:type="gramEnd"/>
-      <w:r>
-        <w:t xml:space="preserve"> Podaci se razmenjuju isključivo u JSON formatu, što omogućava da se </w:t>
+        <w:t>Timovi se prijavljuju za učešće i tokom večeri osvajaju poene, a njihov plasman se prati kroz celu sezonu.</w:t>
+      </w:r>
+      <w:proofErr w:type="gramEnd"/>
+    </w:p>
+    <w:p/>
+    <w:p>
+      <w:r>
+        <w:t xml:space="preserve">U praksi organizatori vode evidenciju ručno — u sveskama </w:t>
+      </w:r>
+      <w:proofErr w:type="gramStart"/>
+      <w:r>
+        <w:t>ili</w:t>
+      </w:r>
+      <w:proofErr w:type="gramEnd"/>
+      <w:r>
+        <w:t xml:space="preserve"> tabelama koje se popunjavaju posle svakog kviza. </w:t>
+      </w:r>
+      <w:proofErr w:type="gramStart"/>
+      <w:r>
+        <w:t>Takav pristup nosi nekoliko problema.</w:t>
+      </w:r>
+      <w:proofErr w:type="gramEnd"/>
+      <w:r>
+        <w:t xml:space="preserve"> Rang lista se preračunava ručno, što oduzima vreme i ostavlja prostor za grešku. </w:t>
+      </w:r>
+      <w:proofErr w:type="gramStart"/>
+      <w:r>
+        <w:t>Timovi nemaju uvid u svoj trenutni plasman između dva termina.</w:t>
+      </w:r>
+      <w:proofErr w:type="gramEnd"/>
+      <w:r>
+        <w:t xml:space="preserve"> </w:t>
+      </w:r>
+      <w:proofErr w:type="gramStart"/>
+      <w:r>
+        <w:t>Podaci iz prethodnih sezona teško se porede jer se čuvaju razjedinjeno.</w:t>
+      </w:r>
+      <w:proofErr w:type="gramEnd"/>
+      <w:r>
+        <w:t xml:space="preserve"> Kada se evidencija vodi </w:t>
       </w:r>
       <w:proofErr w:type="gramStart"/>
       <w:r>
@@ -3166,23 +3271,43 @@
       </w:r>
       <w:proofErr w:type="gramEnd"/>
       <w:r>
-        <w:t xml:space="preserve"> ovaj sistem kasnije poveže bilo koji klijent — veb stranica, mobilna aplikacija ili prikaz na ekranu u samom lokalu.</w:t>
+        <w:t xml:space="preserve"> jednom računaru ili u jednoj svesci, pristup podacima ima samo osoba koja ih vodi.</w:t>
+      </w:r>
+    </w:p>
+    <w:p/>
+    <w:p>
+      <w:r>
+        <w:t xml:space="preserve">Aplikacija opisana u ovom radu rešava navedene probleme tako što evidenciju drži </w:t>
+      </w:r>
+      <w:proofErr w:type="gramStart"/>
+      <w:r>
+        <w:t>na</w:t>
+      </w:r>
+      <w:proofErr w:type="gramEnd"/>
+      <w:r>
+        <w:t xml:space="preserve"> jednom mestu, a rang listu računa automatski na osnovu upisanih rezultata.</w:t>
       </w:r>
     </w:p>
     <w:p>
       <w:pPr>
         <w:pStyle w:val="Heading2"/>
       </w:pPr>
-      <w:bookmarkStart w:id="2" w:name="_Toc238910163"/>
-      <w:r>
-        <w:t>Opis problema</w:t>
-      </w:r>
-      <w:bookmarkEnd w:id="2"/>
-    </w:p>
-    <w:p>
-      <w:proofErr w:type="gramStart"/>
-      <w:r>
-        <w:t>Pub kviz je takmičenje koje se održava u ugostiteljskim objektima, obično jednom nedeljno, tokom sezone koja traje nekoliko meseci.</w:t>
+      <w:bookmarkStart w:id="4" w:name="_Toc238910783"/>
+      <w:r>
+        <w:t>Korisnički zahtev</w:t>
+      </w:r>
+      <w:bookmarkEnd w:id="4"/>
+    </w:p>
+    <w:p>
+      <w:r>
+        <w:t>Aplikacija treba da omogući sledeće:</w:t>
+      </w:r>
+    </w:p>
+    <w:p/>
+    <w:p>
+      <w:proofErr w:type="gramStart"/>
+      <w:r>
+        <w:t>Vođenje sezona.</w:t>
       </w:r>
       <w:proofErr w:type="gramEnd"/>
       <w:r>
@@ -3190,34 +3315,50 @@
       </w:r>
       <w:proofErr w:type="gramStart"/>
       <w:r>
-        <w:t>Timovi se prijavljuju za učešće i tokom večeri osvajaju poene, a njihov plasman se prati kroz celu sezonu.</w:t>
+        <w:t>Sistem vodi evidenciju sezona takmičenja, pri čemu svaka sezona ima naziv, datum početka i datum završetka.</w:t>
+      </w:r>
+      <w:proofErr w:type="gramEnd"/>
+      <w:r>
+        <w:t xml:space="preserve"> </w:t>
+      </w:r>
+      <w:proofErr w:type="gramStart"/>
+      <w:r>
+        <w:t>Korisnik može da pristupi podacima o pojedinačnoj sezoni i o svemu što joj pripada.</w:t>
       </w:r>
       <w:proofErr w:type="gramEnd"/>
     </w:p>
     <w:p/>
     <w:p>
-      <w:r>
-        <w:t xml:space="preserve">U praksi organizatori vode evidenciju ručno — u sveskama </w:t>
-      </w:r>
-      <w:proofErr w:type="gramStart"/>
-      <w:r>
-        <w:t>ili</w:t>
-      </w:r>
-      <w:proofErr w:type="gramEnd"/>
-      <w:r>
-        <w:t xml:space="preserve"> tabelama koje se popunjavaju posle svakog kviza. </w:t>
-      </w:r>
-      <w:proofErr w:type="gramStart"/>
-      <w:r>
-        <w:t>Takav pristup nosi nekoliko problema.</w:t>
-      </w:r>
-      <w:proofErr w:type="gramEnd"/>
-      <w:r>
-        <w:t xml:space="preserve"> Rang lista se preračunava ručno, što oduzima vreme i ostavlja prostor za grešku. </w:t>
-      </w:r>
-      <w:proofErr w:type="gramStart"/>
-      <w:r>
-        <w:t>Timovi nemaju uvid u svoj trenutni plasman između dva termina.</w:t>
+      <w:proofErr w:type="gramStart"/>
+      <w:r>
+        <w:t>Prikaz aktuelnih događaja.</w:t>
+      </w:r>
+      <w:proofErr w:type="gramEnd"/>
+      <w:r>
+        <w:t xml:space="preserve"> Sistem prikazuje predstojeće kviz večeri, poređane hronološki </w:t>
+      </w:r>
+      <w:proofErr w:type="gramStart"/>
+      <w:r>
+        <w:t>od</w:t>
+      </w:r>
+      <w:proofErr w:type="gramEnd"/>
+      <w:r>
+        <w:t xml:space="preserve"> najbližeg termina. Događaji koji su već održani ne prikazuju se u ovom pregledu, </w:t>
+      </w:r>
+      <w:proofErr w:type="gramStart"/>
+      <w:r>
+        <w:t>ali</w:t>
+      </w:r>
+      <w:proofErr w:type="gramEnd"/>
+      <w:r>
+        <w:t xml:space="preserve"> ostaju u evidenciji.</w:t>
+      </w:r>
+    </w:p>
+    <w:p/>
+    <w:p>
+      <w:proofErr w:type="gramStart"/>
+      <w:r>
+        <w:t>Registracija timova.</w:t>
       </w:r>
       <w:proofErr w:type="gramEnd"/>
       <w:r>
@@ -3225,154 +3366,52 @@
       </w:r>
       <w:proofErr w:type="gramStart"/>
       <w:r>
-        <w:t>Podaci iz prethodnih sezona teško se porede jer se čuvaju razjedinjeno.</w:t>
-      </w:r>
-      <w:proofErr w:type="gramEnd"/>
-      <w:r>
-        <w:t xml:space="preserve"> Kada se evidencija vodi </w:t>
-      </w:r>
-      <w:proofErr w:type="gramStart"/>
-      <w:r>
-        <w:t>na</w:t>
-      </w:r>
-      <w:proofErr w:type="gramEnd"/>
-      <w:r>
-        <w:t xml:space="preserve"> jednom računaru ili u jednoj svesci, pristup podacima ima samo osoba koja ih vodi.</w:t>
-      </w:r>
+        <w:t>Timovi se prijavljuju za učešće u određenoj sezoni.</w:t>
+      </w:r>
+      <w:proofErr w:type="gramEnd"/>
+      <w:r>
+        <w:t xml:space="preserve"> </w:t>
+      </w:r>
+      <w:proofErr w:type="gramStart"/>
+      <w:r>
+        <w:t>Prilikom prijave se evidentiraju naziv tima i kontakt adresa elektronske pošte.</w:t>
+      </w:r>
+      <w:proofErr w:type="gramEnd"/>
     </w:p>
     <w:p/>
     <w:p>
-      <w:r>
-        <w:t xml:space="preserve">Aplikacija opisana u ovom radu rešava navedene probleme tako što evidenciju drži </w:t>
-      </w:r>
-      <w:proofErr w:type="gramStart"/>
-      <w:r>
-        <w:t>na</w:t>
-      </w:r>
-      <w:proofErr w:type="gramEnd"/>
-      <w:r>
-        <w:t xml:space="preserve"> jednom mestu, a rang listu računa automatski na osnovu upisanih rezultata.</w:t>
-      </w:r>
-    </w:p>
-    <w:p>
-      <w:pPr>
-        <w:pStyle w:val="Heading2"/>
-      </w:pPr>
-      <w:bookmarkStart w:id="3" w:name="_Toc238910164"/>
-      <w:r>
-        <w:t>Korisnički zahtev</w:t>
-      </w:r>
-      <w:bookmarkEnd w:id="3"/>
-    </w:p>
-    <w:p>
-      <w:r>
-        <w:t>Aplikacija treba da omogući sledeće:</w:t>
+      <w:proofErr w:type="gramStart"/>
+      <w:r>
+        <w:t>Evidencija rezultata.</w:t>
+      </w:r>
+      <w:proofErr w:type="gramEnd"/>
+      <w:r>
+        <w:t xml:space="preserve"> Za svaki održani događaj upisuje se broj poena koji je pojedini </w:t>
+      </w:r>
+      <w:proofErr w:type="gramStart"/>
+      <w:r>
+        <w:t>tim</w:t>
+      </w:r>
+      <w:proofErr w:type="gramEnd"/>
+      <w:r>
+        <w:t xml:space="preserve"> osvojio. Sistem sprečava da se za isti </w:t>
+      </w:r>
+      <w:proofErr w:type="gramStart"/>
+      <w:r>
+        <w:t>tim</w:t>
+      </w:r>
+      <w:proofErr w:type="gramEnd"/>
+      <w:r>
+        <w:t xml:space="preserve"> na istom događaju rezultat upiše više puta.</w:t>
       </w:r>
     </w:p>
     <w:p/>
     <w:p>
-      <w:proofErr w:type="gramStart"/>
-      <w:r>
-        <w:t>Vođenje sezona.</w:t>
-      </w:r>
-      <w:proofErr w:type="gramEnd"/>
-      <w:r>
-        <w:t xml:space="preserve"> </w:t>
-      </w:r>
-      <w:proofErr w:type="gramStart"/>
-      <w:r>
-        <w:t>Sistem vodi evidenciju sezona takmičenja, pri čemu svaka sezona ima naziv, datum početka i datum završetka.</w:t>
-      </w:r>
-      <w:proofErr w:type="gramEnd"/>
-      <w:r>
-        <w:t xml:space="preserve"> </w:t>
-      </w:r>
-      <w:proofErr w:type="gramStart"/>
-      <w:r>
-        <w:t>Korisnik može da pristupi podacima o pojedinačnoj sezoni i o svemu što joj pripada.</w:t>
-      </w:r>
-      <w:proofErr w:type="gramEnd"/>
-    </w:p>
-    <w:p/>
-    <w:p>
-      <w:proofErr w:type="gramStart"/>
-      <w:r>
-        <w:t>Prikaz aktuelnih događaja.</w:t>
-      </w:r>
-      <w:proofErr w:type="gramEnd"/>
-      <w:r>
-        <w:t xml:space="preserve"> Sistem prikazuje predstojeće kviz večeri, poređane hronološki </w:t>
-      </w:r>
-      <w:proofErr w:type="gramStart"/>
-      <w:r>
-        <w:t>od</w:t>
-      </w:r>
-      <w:proofErr w:type="gramEnd"/>
-      <w:r>
-        <w:t xml:space="preserve"> najbližeg termina. Događaji koji su već održani ne prikazuju se u ovom pregledu, </w:t>
-      </w:r>
-      <w:proofErr w:type="gramStart"/>
-      <w:r>
-        <w:t>ali</w:t>
-      </w:r>
-      <w:proofErr w:type="gramEnd"/>
-      <w:r>
-        <w:t xml:space="preserve"> ostaju u evidenciji.</w:t>
-      </w:r>
-    </w:p>
-    <w:p/>
-    <w:p>
-      <w:proofErr w:type="gramStart"/>
-      <w:r>
-        <w:t>Registracija timova.</w:t>
-      </w:r>
-      <w:proofErr w:type="gramEnd"/>
-      <w:r>
-        <w:t xml:space="preserve"> </w:t>
-      </w:r>
-      <w:proofErr w:type="gramStart"/>
-      <w:r>
-        <w:t>Timovi se prijavljuju za učešće u određenoj sezoni.</w:t>
-      </w:r>
-      <w:proofErr w:type="gramEnd"/>
-      <w:r>
-        <w:t xml:space="preserve"> </w:t>
-      </w:r>
-      <w:proofErr w:type="gramStart"/>
-      <w:r>
-        <w:t>Prilikom prijave se evidentiraju naziv tima i kontakt adresa elektronske pošte.</w:t>
-      </w:r>
-      <w:proofErr w:type="gramEnd"/>
-    </w:p>
-    <w:p/>
-    <w:p>
-      <w:proofErr w:type="gramStart"/>
-      <w:r>
-        <w:t>Evidencija rezultata.</w:t>
-      </w:r>
-      <w:proofErr w:type="gramEnd"/>
-      <w:r>
-        <w:t xml:space="preserve"> Za svaki održani događaj upisuje se broj poena koji je pojedini </w:t>
-      </w:r>
-      <w:proofErr w:type="gramStart"/>
-      <w:r>
-        <w:t>tim</w:t>
-      </w:r>
-      <w:proofErr w:type="gramEnd"/>
-      <w:r>
-        <w:t xml:space="preserve"> osvojio. Sistem sprečava da se za isti </w:t>
-      </w:r>
-      <w:proofErr w:type="gramStart"/>
-      <w:r>
-        <w:t>tim</w:t>
-      </w:r>
-      <w:proofErr w:type="gramEnd"/>
-      <w:r>
-        <w:t xml:space="preserve"> na istom događaju rezultat upiše više puta.</w:t>
-      </w:r>
-    </w:p>
-    <w:p/>
-    <w:p>
+      <w:pPr>
+        <w:rPr>
+          <w:lang w:val="fr-FR"/>
+        </w:rPr>
+      </w:pPr>
       <w:proofErr w:type="gramStart"/>
       <w:r>
         <w:lastRenderedPageBreak/>
@@ -3388,205 +3427,195 @@
       </w:r>
       <w:proofErr w:type="gramEnd"/>
       <w:r>
-        <w:t xml:space="preserve"> pozicijom svakog tima i brojem odigranih događaja. Tabela se ne čuva unapred, već se računa u trenutku pristupa, pa se ažurira </w:t>
-      </w:r>
-      <w:proofErr w:type="gramStart"/>
-      <w:r>
-        <w:t>sama</w:t>
-      </w:r>
-      <w:proofErr w:type="gramEnd"/>
-      <w:r>
-        <w:t xml:space="preserve"> nakon svakog upisanog rezultata.</w:t>
-      </w:r>
+        <w:t xml:space="preserve"> pozicijom svakog tima i brojem odigranih događaja. </w:t>
+      </w:r>
+      <w:r>
+        <w:rPr>
+          <w:lang w:val="fr-FR"/>
+        </w:rPr>
+        <w:t>Tabela se ne čuva unapred, već se računa u trenutku pristupa, pa se ažurira sama nakon svakog upisanog rezultata.</w:t>
+      </w:r>
+    </w:p>
+    <w:p>
+      <w:pPr>
+        <w:rPr>
+          <w:lang w:val="fr-FR"/>
+        </w:rPr>
+      </w:pPr>
+    </w:p>
+    <w:p>
+      <w:pPr>
+        <w:rPr>
+          <w:lang w:val="fr-FR"/>
+        </w:rPr>
+      </w:pPr>
+      <w:r>
+        <w:rPr>
+          <w:lang w:val="fr-FR"/>
+        </w:rPr>
+        <w:t>Upravljanje korisnicima. Sistem omogućava registraciju, prijavu i odjavu korisnika. Prijavljeni korisnik dobija pristupni token kojim se dokazuje prilikom svakog narednog zahteva.</w:t>
+      </w:r>
+    </w:p>
+    <w:p>
+      <w:pPr>
+        <w:rPr>
+          <w:lang w:val="fr-FR"/>
+        </w:rPr>
+      </w:pPr>
+    </w:p>
+    <w:p>
+      <w:pPr>
+        <w:rPr>
+          <w:lang w:val="fr-FR"/>
+        </w:rPr>
+      </w:pPr>
+      <w:r>
+        <w:rPr>
+          <w:lang w:val="fr-FR"/>
+        </w:rPr>
+        <w:t>Kontrola pristupa. Pregled podataka dostupan je svima, dok su izmene podataka dozvoljene samo prijavljenim korisnicima.</w:t>
+      </w:r>
+    </w:p>
+    <w:p>
+      <w:pPr>
+        <w:pStyle w:val="Heading2"/>
+      </w:pPr>
+      <w:bookmarkStart w:id="5" w:name="_Toc238910784"/>
+      <w:r>
+        <w:t>Korisnici sistema</w:t>
+      </w:r>
+      <w:bookmarkEnd w:id="5"/>
+    </w:p>
+    <w:p>
+      <w:pPr>
+        <w:rPr>
+          <w:lang w:val="fr-FR"/>
+        </w:rPr>
+      </w:pPr>
+      <w:r>
+        <w:rPr>
+          <w:lang w:val="fr-FR"/>
+        </w:rPr>
+        <w:t>U sistemu postoje dve vrste korisnika.</w:t>
+      </w:r>
+    </w:p>
+    <w:p>
+      <w:pPr>
+        <w:rPr>
+          <w:lang w:val="fr-FR"/>
+        </w:rPr>
+      </w:pPr>
+    </w:p>
+    <w:p>
+      <w:pPr>
+        <w:rPr>
+          <w:lang w:val="fr-FR"/>
+        </w:rPr>
+      </w:pPr>
+      <w:r>
+        <w:rPr>
+          <w:lang w:val="fr-FR"/>
+        </w:rPr>
+        <w:t>Neprijavljeni posetilac može da pregleda sezone, timove, održane i predstojeće događaje, kao i rang listu. Ne može da menja nikakve podatke.</w:t>
+      </w:r>
+    </w:p>
+    <w:p>
+      <w:pPr>
+        <w:rPr>
+          <w:lang w:val="fr-FR"/>
+        </w:rPr>
+      </w:pPr>
+    </w:p>
+    <w:p>
+      <w:pPr>
+        <w:rPr>
+          <w:lang w:val="fr-FR"/>
+        </w:rPr>
+      </w:pPr>
+      <w:r>
+        <w:rPr>
+          <w:lang w:val="fr-FR"/>
+        </w:rPr>
+        <w:t>Prijavljeni korisnik (organizator) ima sva prava neprijavljenog posetioca, a uz to može da kreira i menja sezone i događaje, registruje timove, upisuje i ispravlja rezultate, kao i da briše postojeće zapise.</w:t>
+      </w:r>
+    </w:p>
+    <w:p>
+      <w:pPr>
+        <w:pStyle w:val="Heading2"/>
+      </w:pPr>
+      <w:bookmarkStart w:id="6" w:name="_Toc238910785"/>
+      <w:r>
+        <w:t>Organizacija podataka</w:t>
+      </w:r>
+      <w:bookmarkEnd w:id="6"/>
+    </w:p>
+    <w:p>
+      <w:pPr>
+        <w:rPr>
+          <w:lang w:val="fr-FR"/>
+        </w:rPr>
+      </w:pPr>
+      <w:r>
+        <w:rPr>
+          <w:lang w:val="fr-FR"/>
+        </w:rPr>
+        <w:t>Podaci su organizovani u četiri međusobno povezane celine. Sezona predstavlja nadređeni okvir i sadrži timove koji u njoj učestvuju i događaje koji se u njoj održavaju. Svaki događaj pripada tačno jednoj sezoni i ima svoj datum i mesto održavanja. Rezultat povezuje jedan tim i jedan događaj sa brojem osvojenih poena, čime se beleži uspeh tog tima te večeri. Rang lista sezone dobija se sabiranjem svih poena koje je tim osvojio na događajima u okviru te sezone.</w:t>
+      </w:r>
+    </w:p>
+    <w:p>
+      <w:pPr>
+        <w:pStyle w:val="Heading1"/>
+      </w:pPr>
+      <w:bookmarkStart w:id="7" w:name="_Toc238910786"/>
+      <w:r>
+        <w:t>Implementacija</w:t>
+      </w:r>
+      <w:bookmarkEnd w:id="7"/>
+    </w:p>
+    <w:p>
+      <w:r>
+        <w:t xml:space="preserve">Aplikacija je razvijena u Laravel radnom okviru, </w:t>
+      </w:r>
+      <w:proofErr w:type="gramStart"/>
+      <w:r>
+        <w:t>na</w:t>
+      </w:r>
+      <w:proofErr w:type="gramEnd"/>
+      <w:r>
+        <w:t xml:space="preserve"> programskom jeziku PHP. </w:t>
+      </w:r>
+      <w:proofErr w:type="gramStart"/>
+      <w:r>
+        <w:t>Kao sistem za upravljanje bazom podataka korišćen je SQLite.</w:t>
+      </w:r>
+      <w:proofErr w:type="gramEnd"/>
+      <w:r>
+        <w:t xml:space="preserve"> </w:t>
+      </w:r>
+      <w:proofErr w:type="gramStart"/>
+      <w:r>
+        <w:t>Autentifikacija je realizovana pomoću biblioteke Laravel Sanctum, a testiranje je obavljeno u alatu Postman.</w:t>
+      </w:r>
+      <w:proofErr w:type="gramEnd"/>
+      <w:r>
+        <w:t xml:space="preserve"> </w:t>
+      </w:r>
+      <w:proofErr w:type="gramStart"/>
+      <w:r>
+        <w:t>U nastavku su prikazani karakteristični delovi implementacije uz objašnjenja.</w:t>
+      </w:r>
+      <w:proofErr w:type="gramEnd"/>
     </w:p>
     <w:p/>
     <w:p>
-      <w:proofErr w:type="gramStart"/>
-      <w:r>
-        <w:t>Upravljanje korisnicima.</w:t>
-      </w:r>
-      <w:proofErr w:type="gramEnd"/>
-      <w:r>
-        <w:t xml:space="preserve"> </w:t>
-      </w:r>
-      <w:proofErr w:type="gramStart"/>
-      <w:r>
-        <w:t>Sistem omogućava registraciju, prijavu i odjavu korisnika.</w:t>
-      </w:r>
-      <w:proofErr w:type="gramEnd"/>
-      <w:r>
-        <w:t xml:space="preserve"> </w:t>
-      </w:r>
-      <w:proofErr w:type="gramStart"/>
-      <w:r>
-        <w:t>Prijavljeni korisnik dobija pristupni token kojim se dokazuje prilikom svakog narednog zahteva.</w:t>
-      </w:r>
-      <w:proofErr w:type="gramEnd"/>
-    </w:p>
-    <w:p/>
-    <w:p>
-      <w:proofErr w:type="gramStart"/>
-      <w:r>
-        <w:t>Kontrola pristupa.</w:t>
-      </w:r>
-      <w:proofErr w:type="gramEnd"/>
-      <w:r>
-        <w:t xml:space="preserve"> </w:t>
-      </w:r>
-      <w:proofErr w:type="gramStart"/>
-      <w:r>
-        <w:t>Pregled podataka dostupan je svima, dok su izmene podataka dozvoljene samo prijavljenim korisnicima.</w:t>
-      </w:r>
-      <w:proofErr w:type="gramEnd"/>
-    </w:p>
-    <w:p>
       <w:pPr>
         <w:pStyle w:val="Heading2"/>
       </w:pPr>
-      <w:bookmarkStart w:id="4" w:name="_Toc238910165"/>
-      <w:r>
-        <w:t>Korisnici sistema</w:t>
-      </w:r>
-      <w:bookmarkEnd w:id="4"/>
-    </w:p>
-    <w:p>
-      <w:proofErr w:type="gramStart"/>
-      <w:r>
-        <w:t>U sistemu postoje dve vrste korisnika.</w:t>
-      </w:r>
-      <w:proofErr w:type="gramEnd"/>
-    </w:p>
-    <w:p/>
-    <w:p>
-      <w:r>
-        <w:t xml:space="preserve">Neprijavljeni posetilac može da pregleda sezone, timove, održane i predstojeće događaje, kao i rang listu. </w:t>
-      </w:r>
-      <w:proofErr w:type="gramStart"/>
-      <w:r>
-        <w:t>Ne može da menja nikakve podatke.</w:t>
-      </w:r>
-      <w:proofErr w:type="gramEnd"/>
-    </w:p>
-    <w:p/>
-    <w:p>
-      <w:r>
-        <w:t xml:space="preserve">Prijavljeni korisnik (organizator) ima sva prava neprijavljenog posetioca, </w:t>
-      </w:r>
-      <w:proofErr w:type="gramStart"/>
-      <w:r>
-        <w:t>a</w:t>
-      </w:r>
-      <w:proofErr w:type="gramEnd"/>
-      <w:r>
-        <w:t xml:space="preserve"> uz to može da kreira i menja sezone i događaje, registruje timove, upisuje i ispravlja rezultate, kao i da briše postojeće zapise.</w:t>
-      </w:r>
-    </w:p>
-    <w:p>
-      <w:pPr>
-        <w:pStyle w:val="Heading2"/>
-      </w:pPr>
-      <w:bookmarkStart w:id="5" w:name="_Toc238910166"/>
-      <w:r>
-        <w:t>Organizacija podataka</w:t>
-      </w:r>
-      <w:bookmarkEnd w:id="5"/>
-    </w:p>
-    <w:p>
-      <w:proofErr w:type="gramStart"/>
-      <w:r>
-        <w:t>Podaci su organizovani u četiri međusobno povezane celine.</w:t>
-      </w:r>
-      <w:proofErr w:type="gramEnd"/>
-      <w:r>
-        <w:t xml:space="preserve"> </w:t>
-      </w:r>
-      <w:proofErr w:type="gramStart"/>
-      <w:r>
-        <w:t>Sezona predstavlja nadređeni okvir i sadrži timove koji u njoj učestvuju i događaje koji se u njoj održavaju.</w:t>
-      </w:r>
-      <w:proofErr w:type="gramEnd"/>
-      <w:r>
-        <w:t xml:space="preserve"> </w:t>
-      </w:r>
-      <w:proofErr w:type="gramStart"/>
-      <w:r>
-        <w:t>Svaki događaj pripada tačno jednoj sezoni i ima svoj datum i mesto održavanja.</w:t>
-      </w:r>
-      <w:proofErr w:type="gramEnd"/>
-      <w:r>
-        <w:t xml:space="preserve"> Rezultat povezuje jedan </w:t>
-      </w:r>
-      <w:proofErr w:type="gramStart"/>
-      <w:r>
-        <w:t>tim</w:t>
-      </w:r>
-      <w:proofErr w:type="gramEnd"/>
-      <w:r>
-        <w:t xml:space="preserve"> i jedan događaj sa brojem osvojenih poena, čime se beleži uspeh tog tima te večeri. Rang lista sezone dobija se sabiranjem svih poena koje je </w:t>
-      </w:r>
-      <w:proofErr w:type="gramStart"/>
-      <w:r>
-        <w:t>tim</w:t>
-      </w:r>
-      <w:proofErr w:type="gramEnd"/>
-      <w:r>
-        <w:t xml:space="preserve"> osvojio na događajima u okviru te sezone.</w:t>
-      </w:r>
-    </w:p>
-    <w:p>
-      <w:pPr>
-        <w:pStyle w:val="Heading1"/>
-      </w:pPr>
-      <w:bookmarkStart w:id="6" w:name="_Toc238910167"/>
-      <w:r>
-        <w:t>Implementacija</w:t>
-      </w:r>
-      <w:bookmarkEnd w:id="6"/>
-    </w:p>
-    <w:p>
-      <w:r>
-        <w:t xml:space="preserve">Aplikacija je razvijena u Laravel radnom okviru, </w:t>
-      </w:r>
-      <w:proofErr w:type="gramStart"/>
-      <w:r>
-        <w:t>na</w:t>
-      </w:r>
-      <w:proofErr w:type="gramEnd"/>
-      <w:r>
-        <w:t xml:space="preserve"> programskom jeziku PHP. </w:t>
-      </w:r>
-      <w:proofErr w:type="gramStart"/>
-      <w:r>
-        <w:t>Kao sistem za upravljanje bazom podataka korišćen je SQLite.</w:t>
-      </w:r>
-      <w:proofErr w:type="gramEnd"/>
-      <w:r>
-        <w:t xml:space="preserve"> </w:t>
-      </w:r>
-      <w:proofErr w:type="gramStart"/>
-      <w:r>
-        <w:t>Autentifikacija je realizovana pomoću biblioteke Laravel Sanctum, a testiranje je obavljeno u alatu Postman.</w:t>
-      </w:r>
-      <w:proofErr w:type="gramEnd"/>
-      <w:r>
-        <w:t xml:space="preserve"> </w:t>
-      </w:r>
-      <w:proofErr w:type="gramStart"/>
-      <w:r>
-        <w:t>U nastavku su prikazani karakteristični delovi implementacije uz objašnjenja.</w:t>
-      </w:r>
-      <w:proofErr w:type="gramEnd"/>
-    </w:p>
-    <w:p/>
-    <w:p>
-      <w:pPr>
-        <w:pStyle w:val="Heading2"/>
-      </w:pPr>
-      <w:bookmarkStart w:id="7" w:name="_Toc238910168"/>
+      <w:bookmarkStart w:id="8" w:name="_Toc238910787"/>
       <w:r>
         <w:t>Struktura baze podataka i migracije</w:t>
       </w:r>
-      <w:bookmarkEnd w:id="7"/>
+      <w:bookmarkEnd w:id="8"/>
     </w:p>
     <w:p/>
     <w:p>
@@ -3996,21 +4025,22 @@
       <w:pPr>
         <w:rPr>
           <w:b/>
-        </w:rPr>
-      </w:pPr>
-      <w:proofErr w:type="gramStart"/>
+          <w:lang w:val="fr-FR"/>
+        </w:rPr>
+      </w:pPr>
       <w:r>
         <w:rPr>
           <w:b/>
+          <w:lang w:val="fr-FR"/>
         </w:rPr>
         <w:t>Dodavanje kolona u postojeću tabelu.</w:t>
       </w:r>
-      <w:proofErr w:type="gramEnd"/>
     </w:p>
     <w:p>
       <w:pPr>
         <w:rPr>
           <w:b/>
+          <w:lang w:val="fr-FR"/>
         </w:rPr>
       </w:pPr>
     </w:p>
@@ -4207,33 +4237,47 @@
       </w:pPr>
     </w:p>
     <w:p>
-      <w:r>
+      <w:pPr>
+        <w:rPr>
+          <w:lang w:val="fr-FR"/>
+        </w:rPr>
+      </w:pPr>
+      <w:r>
+        <w:rPr>
+          <w:lang w:val="fr-FR"/>
+        </w:rPr>
         <w:t xml:space="preserve">Za razliku od prethodnog primera, ovde se koristi </w:t>
       </w:r>
       <w:r>
         <w:rPr>
           <w:rStyle w:val="HTMLCode"/>
           <w:rFonts w:eastAsiaTheme="minorHAnsi"/>
-        </w:rPr>
-        <w:t>Schema::</w:t>
+          <w:lang w:val="fr-FR"/>
+        </w:rPr>
+        <w:t>Schema</w:t>
       </w:r>
       <w:proofErr w:type="gramStart"/>
       <w:r>
         <w:rPr>
           <w:rStyle w:val="HTMLCode"/>
           <w:rFonts w:eastAsiaTheme="minorHAnsi"/>
-        </w:rPr>
-        <w:t>table(</w:t>
+          <w:lang w:val="fr-FR"/>
+        </w:rPr>
+        <w:t>::table</w:t>
       </w:r>
       <w:proofErr w:type="gramEnd"/>
       <w:r>
         <w:rPr>
           <w:rStyle w:val="HTMLCode"/>
           <w:rFonts w:eastAsiaTheme="minorHAnsi"/>
-        </w:rPr>
-        <w:t>)</w:t>
-      </w:r>
-      <w:r>
+          <w:lang w:val="fr-FR"/>
+        </w:rPr>
+        <w:t>()</w:t>
+      </w:r>
+      <w:r>
+        <w:rPr>
+          <w:lang w:val="fr-FR"/>
+        </w:rPr>
         <w:t xml:space="preserve"> jer se menja postojeća tabela. Kolone su definisane kao </w:t>
       </w:r>
       <w:proofErr w:type="gramStart"/>
@@ -4241,6 +4285,7 @@
         <w:rPr>
           <w:rStyle w:val="HTMLCode"/>
           <w:rFonts w:eastAsiaTheme="minorHAnsi"/>
+          <w:lang w:val="fr-FR"/>
         </w:rPr>
         <w:t>nullable(</w:t>
       </w:r>
@@ -4249,22 +4294,38 @@
         <w:rPr>
           <w:rStyle w:val="HTMLCode"/>
           <w:rFonts w:eastAsiaTheme="minorHAnsi"/>
+          <w:lang w:val="fr-FR"/>
         </w:rPr>
         <w:t>)</w:t>
       </w:r>
       <w:r>
+        <w:rPr>
+          <w:lang w:val="fr-FR"/>
+        </w:rPr>
         <w:t>, budući da tabela u trenutku izmene već sadrži zapise za koje vrednost nove kolone nije poznata.</w:t>
       </w:r>
     </w:p>
     <w:p>
       <w:pPr>
         <w:spacing w:after="160"/>
-      </w:pPr>
-      <w:r>
+        <w:rPr>
+          <w:lang w:val="fr-FR"/>
+        </w:rPr>
+      </w:pPr>
+      <w:r>
+        <w:rPr>
+          <w:lang w:val="fr-FR"/>
+        </w:rPr>
         <w:br w:type="page"/>
       </w:r>
     </w:p>
-    <w:p/>
+    <w:p>
+      <w:pPr>
+        <w:rPr>
+          <w:lang w:val="fr-FR"/>
+        </w:rPr>
+      </w:pPr>
+    </w:p>
     <w:p>
       <w:pPr>
         <w:rPr>
@@ -4445,7 +4506,15 @@
       </w:pPr>
     </w:p>
     <w:p>
-      <w:r>
+      <w:pPr>
+        <w:rPr>
+          <w:lang w:val="fr-FR"/>
+        </w:rPr>
+      </w:pPr>
+      <w:r>
+        <w:rPr>
+          <w:lang w:val="fr-FR"/>
+        </w:rPr>
         <w:t xml:space="preserve">Metoda </w:t>
       </w:r>
       <w:proofErr w:type="gramStart"/>
@@ -4453,6 +4522,7 @@
         <w:rPr>
           <w:rStyle w:val="HTMLCode"/>
           <w:rFonts w:eastAsiaTheme="minorHAnsi"/>
+          <w:lang w:val="fr-FR"/>
         </w:rPr>
         <w:t>change(</w:t>
       </w:r>
@@ -4461,22 +4531,24 @@
         <w:rPr>
           <w:rStyle w:val="HTMLCode"/>
           <w:rFonts w:eastAsiaTheme="minorHAnsi"/>
+          <w:lang w:val="fr-FR"/>
         </w:rPr>
         <w:t>)</w:t>
       </w:r>
       <w:r>
-        <w:t xml:space="preserve"> označava da se postojeća kolona menja, a ne da se kreira nova. Tip je promenjen iz celobrojnog u decimalni, jer se </w:t>
-      </w:r>
-      <w:proofErr w:type="gramStart"/>
-      <w:r>
-        <w:t>na</w:t>
-      </w:r>
-      <w:proofErr w:type="gramEnd"/>
-      <w:r>
-        <w:t xml:space="preserve"> kviz večerima poeni često dodeljuju u polovinama.</w:t>
-      </w:r>
-    </w:p>
-    <w:p/>
+        <w:rPr>
+          <w:lang w:val="fr-FR"/>
+        </w:rPr>
+        <w:t xml:space="preserve"> označava da se postojeća kolona menja, a ne da se kreira nova. Tip je promenjen iz celobrojnog u decimalni, jer se na kviz večerima poeni često dodeljuju u polovinama.</w:t>
+      </w:r>
+    </w:p>
+    <w:p>
+      <w:pPr>
+        <w:rPr>
+          <w:lang w:val="fr-FR"/>
+        </w:rPr>
+      </w:pPr>
+    </w:p>
     <w:p>
       <w:pPr>
         <w:rPr>
@@ -5225,11 +5297,11 @@
       <w:pPr>
         <w:pStyle w:val="Heading2"/>
       </w:pPr>
-      <w:bookmarkStart w:id="8" w:name="_Toc238910169"/>
+      <w:bookmarkStart w:id="9" w:name="_Toc238910788"/>
       <w:r>
         <w:t>Modeli i veze između entiteta</w:t>
       </w:r>
-      <w:bookmarkEnd w:id="8"/>
+      <w:bookmarkEnd w:id="9"/>
     </w:p>
     <w:p>
       <w:proofErr w:type="gramStart"/>
@@ -6314,11 +6386,11 @@
       <w:pPr>
         <w:pStyle w:val="Heading2"/>
       </w:pPr>
-      <w:bookmarkStart w:id="9" w:name="_Toc238910170"/>
+      <w:bookmarkStart w:id="10" w:name="_Toc238910789"/>
       <w:r>
         <w:t>Autentifikacija korisnika</w:t>
       </w:r>
-      <w:bookmarkEnd w:id="9"/>
+      <w:bookmarkEnd w:id="10"/>
     </w:p>
     <w:p/>
     <w:p>
@@ -7688,16 +7760,6 @@
           <w:lang w:val="fr-FR"/>
         </w:rPr>
       </w:pPr>
-      <w:r>
-        <w:rPr>
-          <w:rFonts w:ascii="var(--font-mono)" w:eastAsia="Times New Roman" w:hAnsi="var(--font-mono)" w:cs="Courier New"/>
-          <w:color w:val="2B303B"/>
-          <w:sz w:val="20"/>
-          <w:szCs w:val="20"/>
-          <w:lang w:val="fr-FR"/>
-        </w:rPr>
-        <w:t>}</w:t>
-      </w:r>
     </w:p>
     <w:p>
       <w:pPr>
@@ -7707,7 +7769,6 @@
           <w:lang w:val="fr-FR"/>
         </w:rPr>
       </w:pPr>
-      <w:bookmarkStart w:id="10" w:name="_GoBack"/>
       <w:r>
         <w:rPr>
           <w:rFonts w:asciiTheme="minorHAnsi" w:eastAsia="Times New Roman" w:hAnsiTheme="minorHAnsi"/>
@@ -7732,7 +7793,6 @@
         <w:t>() upoređuje unetu lozinku sa sačuvanim otiskom. Poruka o grešci namerno je formulisana tako da ne otkriva da li ne postoji korisnik ili je pogrešna lozinka, kako se ne bi omogućila provera postojanja naloga.</w:t>
       </w:r>
     </w:p>
-    <w:bookmarkEnd w:id="10"/>
     <w:p>
       <w:pPr>
         <w:spacing w:after="160"/>
@@ -7821,201 +7881,201 @@
           <w:rFonts w:ascii="Courier New" w:eastAsia="Times New Roman" w:hAnsi="Courier New" w:cs="Courier New"/>
           <w:sz w:val="18"/>
           <w:szCs w:val="18"/>
+        </w:rPr>
+      </w:pPr>
+      <w:r>
+        <w:rPr>
+          <w:rFonts w:ascii="Courier New" w:eastAsia="Times New Roman" w:hAnsi="Courier New" w:cs="Courier New"/>
+          <w:sz w:val="18"/>
+          <w:szCs w:val="18"/>
           <w:lang w:val="fr-FR"/>
         </w:rPr>
-      </w:pPr>
+        <w:t xml:space="preserve">    </w:t>
+      </w:r>
       <w:r>
         <w:rPr>
           <w:rFonts w:ascii="Courier New" w:eastAsia="Times New Roman" w:hAnsi="Courier New" w:cs="Courier New"/>
           <w:sz w:val="18"/>
           <w:szCs w:val="18"/>
+        </w:rPr>
+        <w:t>$request-&gt;</w:t>
+      </w:r>
+      <w:proofErr w:type="gramStart"/>
+      <w:r>
+        <w:rPr>
+          <w:rFonts w:ascii="Courier New" w:eastAsia="Times New Roman" w:hAnsi="Courier New" w:cs="Courier New"/>
+          <w:sz w:val="18"/>
+          <w:szCs w:val="18"/>
+        </w:rPr>
+        <w:t>user(</w:t>
+      </w:r>
+      <w:proofErr w:type="gramEnd"/>
+      <w:r>
+        <w:rPr>
+          <w:rFonts w:ascii="Courier New" w:eastAsia="Times New Roman" w:hAnsi="Courier New" w:cs="Courier New"/>
+          <w:sz w:val="18"/>
+          <w:szCs w:val="18"/>
+        </w:rPr>
+        <w:t>)-&gt;currentAccessToken()-&gt;delete();</w:t>
+      </w:r>
+    </w:p>
+    <w:p>
+      <w:pPr>
+        <w:spacing w:before="100" w:beforeAutospacing="1" w:after="100" w:afterAutospacing="1" w:line="240" w:lineRule="auto"/>
+        <w:rPr>
+          <w:rFonts w:ascii="Courier New" w:eastAsia="Times New Roman" w:hAnsi="Courier New" w:cs="Courier New"/>
+          <w:sz w:val="18"/>
+          <w:szCs w:val="18"/>
+        </w:rPr>
+      </w:pPr>
+    </w:p>
+    <w:p>
+      <w:pPr>
+        <w:spacing w:before="100" w:beforeAutospacing="1" w:after="100" w:afterAutospacing="1" w:line="240" w:lineRule="auto"/>
+        <w:rPr>
+          <w:rFonts w:ascii="Courier New" w:eastAsia="Times New Roman" w:hAnsi="Courier New" w:cs="Courier New"/>
+          <w:sz w:val="18"/>
+          <w:szCs w:val="18"/>
+        </w:rPr>
+      </w:pPr>
+      <w:r>
+        <w:rPr>
+          <w:rFonts w:ascii="Courier New" w:eastAsia="Times New Roman" w:hAnsi="Courier New" w:cs="Courier New"/>
+          <w:sz w:val="18"/>
+          <w:szCs w:val="18"/>
+        </w:rPr>
+        <w:t xml:space="preserve">    </w:t>
+      </w:r>
+      <w:proofErr w:type="gramStart"/>
+      <w:r>
+        <w:rPr>
+          <w:rFonts w:ascii="Courier New" w:eastAsia="Times New Roman" w:hAnsi="Courier New" w:cs="Courier New"/>
+          <w:sz w:val="18"/>
+          <w:szCs w:val="18"/>
+        </w:rPr>
+        <w:t>return</w:t>
+      </w:r>
+      <w:proofErr w:type="gramEnd"/>
+      <w:r>
+        <w:rPr>
+          <w:rFonts w:ascii="Courier New" w:eastAsia="Times New Roman" w:hAnsi="Courier New" w:cs="Courier New"/>
+          <w:sz w:val="18"/>
+          <w:szCs w:val="18"/>
+        </w:rPr>
+        <w:t xml:space="preserve"> response()-&gt;json([</w:t>
+      </w:r>
+    </w:p>
+    <w:p>
+      <w:pPr>
+        <w:spacing w:before="100" w:beforeAutospacing="1" w:after="100" w:afterAutospacing="1" w:line="240" w:lineRule="auto"/>
+        <w:rPr>
+          <w:rFonts w:ascii="Courier New" w:eastAsia="Times New Roman" w:hAnsi="Courier New" w:cs="Courier New"/>
+          <w:sz w:val="18"/>
+          <w:szCs w:val="18"/>
+        </w:rPr>
+      </w:pPr>
+      <w:r>
+        <w:rPr>
+          <w:rFonts w:ascii="Courier New" w:eastAsia="Times New Roman" w:hAnsi="Courier New" w:cs="Courier New"/>
+          <w:sz w:val="18"/>
+          <w:szCs w:val="18"/>
+        </w:rPr>
+        <w:t xml:space="preserve">        '</w:t>
+      </w:r>
+      <w:proofErr w:type="gramStart"/>
+      <w:r>
+        <w:rPr>
+          <w:rFonts w:ascii="Courier New" w:eastAsia="Times New Roman" w:hAnsi="Courier New" w:cs="Courier New"/>
+          <w:sz w:val="18"/>
+          <w:szCs w:val="18"/>
+        </w:rPr>
+        <w:t>message</w:t>
+      </w:r>
+      <w:proofErr w:type="gramEnd"/>
+      <w:r>
+        <w:rPr>
+          <w:rFonts w:ascii="Courier New" w:eastAsia="Times New Roman" w:hAnsi="Courier New" w:cs="Courier New"/>
+          <w:sz w:val="18"/>
+          <w:szCs w:val="18"/>
+        </w:rPr>
+        <w:t>' =&gt; 'Uspesno ste odjavljeni.',</w:t>
+      </w:r>
+    </w:p>
+    <w:p>
+      <w:pPr>
+        <w:spacing w:before="100" w:beforeAutospacing="1" w:after="100" w:afterAutospacing="1" w:line="240" w:lineRule="auto"/>
+        <w:rPr>
+          <w:rFonts w:ascii="Courier New" w:eastAsia="Times New Roman" w:hAnsi="Courier New" w:cs="Courier New"/>
+          <w:sz w:val="18"/>
+          <w:szCs w:val="18"/>
           <w:lang w:val="fr-FR"/>
         </w:rPr>
-        <w:t xml:space="preserve">    $request-&gt;</w:t>
-      </w:r>
-      <w:proofErr w:type="gramStart"/>
+      </w:pPr>
       <w:r>
         <w:rPr>
           <w:rFonts w:ascii="Courier New" w:eastAsia="Times New Roman" w:hAnsi="Courier New" w:cs="Courier New"/>
           <w:sz w:val="18"/>
           <w:szCs w:val="18"/>
+        </w:rPr>
+        <w:t xml:space="preserve">    </w:t>
+      </w:r>
+      <w:r>
+        <w:rPr>
+          <w:rFonts w:ascii="Courier New" w:eastAsia="Times New Roman" w:hAnsi="Courier New" w:cs="Courier New"/>
+          <w:sz w:val="18"/>
+          <w:szCs w:val="18"/>
           <w:lang w:val="fr-FR"/>
         </w:rPr>
-        <w:t>user(</w:t>
-      </w:r>
-      <w:proofErr w:type="gramEnd"/>
-      <w:r>
+        <w:t>], 200);</w:t>
+      </w:r>
+    </w:p>
+    <w:p>
+      <w:pPr>
+        <w:spacing w:before="100" w:beforeAutospacing="1" w:after="100" w:afterAutospacing="1" w:line="240" w:lineRule="auto"/>
         <w:rPr>
           <w:rFonts w:ascii="Courier New" w:eastAsia="Times New Roman" w:hAnsi="Courier New" w:cs="Courier New"/>
           <w:sz w:val="18"/>
           <w:szCs w:val="18"/>
           <w:lang w:val="fr-FR"/>
         </w:rPr>
-        <w:t>)-&gt;currentAccessToken()-&gt;delete();</w:t>
+      </w:pPr>
+      <w:r>
+        <w:rPr>
+          <w:rFonts w:ascii="Courier New" w:eastAsia="Times New Roman" w:hAnsi="Courier New" w:cs="Courier New"/>
+          <w:sz w:val="18"/>
+          <w:szCs w:val="18"/>
+          <w:lang w:val="fr-FR"/>
+        </w:rPr>
+        <w:t>}</w:t>
       </w:r>
     </w:p>
     <w:p>
       <w:pPr>
         <w:spacing w:before="100" w:beforeAutospacing="1" w:after="100" w:afterAutospacing="1" w:line="240" w:lineRule="auto"/>
         <w:rPr>
-          <w:rFonts w:ascii="Courier New" w:eastAsia="Times New Roman" w:hAnsi="Courier New" w:cs="Courier New"/>
-          <w:sz w:val="18"/>
-          <w:szCs w:val="18"/>
           <w:lang w:val="fr-FR"/>
         </w:rPr>
       </w:pPr>
+      <w:r>
+        <w:rPr>
+          <w:lang w:val="fr-FR"/>
+        </w:rPr>
+        <w:t>Odjavom se briše isključivo token kojim je poslat zahtev za odjavu. Ostali tokeni istog korisnika nastavljaju da važe, čime je omogućeno da korisnik bude prijavljen sa više uređaja i da se odjavi sa svakog pojedinačno.</w:t>
+      </w:r>
     </w:p>
     <w:p>
       <w:pPr>
         <w:spacing w:before="100" w:beforeAutospacing="1" w:after="100" w:afterAutospacing="1" w:line="240" w:lineRule="auto"/>
         <w:rPr>
-          <w:rFonts w:ascii="Courier New" w:eastAsia="Times New Roman" w:hAnsi="Courier New" w:cs="Courier New"/>
-          <w:sz w:val="18"/>
-          <w:szCs w:val="18"/>
           <w:lang w:val="fr-FR"/>
         </w:rPr>
       </w:pPr>
-      <w:r>
-        <w:rPr>
-          <w:rFonts w:ascii="Courier New" w:eastAsia="Times New Roman" w:hAnsi="Courier New" w:cs="Courier New"/>
-          <w:sz w:val="18"/>
-          <w:szCs w:val="18"/>
-          <w:lang w:val="fr-FR"/>
-        </w:rPr>
-        <w:t xml:space="preserve">    return </w:t>
-      </w:r>
-      <w:proofErr w:type="gramStart"/>
-      <w:r>
-        <w:rPr>
-          <w:rFonts w:ascii="Courier New" w:eastAsia="Times New Roman" w:hAnsi="Courier New" w:cs="Courier New"/>
-          <w:sz w:val="18"/>
-          <w:szCs w:val="18"/>
-          <w:lang w:val="fr-FR"/>
-        </w:rPr>
-        <w:t>response(</w:t>
-      </w:r>
-      <w:proofErr w:type="gramEnd"/>
-      <w:r>
-        <w:rPr>
-          <w:rFonts w:ascii="Courier New" w:eastAsia="Times New Roman" w:hAnsi="Courier New" w:cs="Courier New"/>
-          <w:sz w:val="18"/>
-          <w:szCs w:val="18"/>
-          <w:lang w:val="fr-FR"/>
-        </w:rPr>
-        <w:t>)-&gt;json([</w:t>
-      </w:r>
-    </w:p>
-    <w:p>
-      <w:pPr>
-        <w:spacing w:before="100" w:beforeAutospacing="1" w:after="100" w:afterAutospacing="1" w:line="240" w:lineRule="auto"/>
-        <w:rPr>
-          <w:rFonts w:ascii="Courier New" w:eastAsia="Times New Roman" w:hAnsi="Courier New" w:cs="Courier New"/>
-          <w:sz w:val="18"/>
-          <w:szCs w:val="18"/>
-          <w:lang w:val="fr-FR"/>
-        </w:rPr>
-      </w:pPr>
-      <w:r>
-        <w:rPr>
-          <w:rFonts w:ascii="Courier New" w:eastAsia="Times New Roman" w:hAnsi="Courier New" w:cs="Courier New"/>
-          <w:sz w:val="18"/>
-          <w:szCs w:val="18"/>
-          <w:lang w:val="fr-FR"/>
-        </w:rPr>
-        <w:t xml:space="preserve">        '</w:t>
-      </w:r>
-      <w:proofErr w:type="gramStart"/>
-      <w:r>
-        <w:rPr>
-          <w:rFonts w:ascii="Courier New" w:eastAsia="Times New Roman" w:hAnsi="Courier New" w:cs="Courier New"/>
-          <w:sz w:val="18"/>
-          <w:szCs w:val="18"/>
-          <w:lang w:val="fr-FR"/>
-        </w:rPr>
-        <w:t>message</w:t>
-      </w:r>
-      <w:proofErr w:type="gramEnd"/>
-      <w:r>
-        <w:rPr>
-          <w:rFonts w:ascii="Courier New" w:eastAsia="Times New Roman" w:hAnsi="Courier New" w:cs="Courier New"/>
-          <w:sz w:val="18"/>
-          <w:szCs w:val="18"/>
-          <w:lang w:val="fr-FR"/>
-        </w:rPr>
-        <w:t>' =&gt; 'Uspesno ste odjavljeni.',</w:t>
-      </w:r>
-    </w:p>
-    <w:p>
-      <w:pPr>
-        <w:spacing w:before="100" w:beforeAutospacing="1" w:after="100" w:afterAutospacing="1" w:line="240" w:lineRule="auto"/>
-        <w:rPr>
-          <w:rFonts w:ascii="Courier New" w:eastAsia="Times New Roman" w:hAnsi="Courier New" w:cs="Courier New"/>
-          <w:sz w:val="18"/>
-          <w:szCs w:val="18"/>
-          <w:lang w:val="fr-FR"/>
-        </w:rPr>
-      </w:pPr>
-      <w:r>
-        <w:rPr>
-          <w:rFonts w:ascii="Courier New" w:eastAsia="Times New Roman" w:hAnsi="Courier New" w:cs="Courier New"/>
-          <w:sz w:val="18"/>
-          <w:szCs w:val="18"/>
-          <w:lang w:val="fr-FR"/>
-        </w:rPr>
-        <w:t xml:space="preserve">    ], 200);</w:t>
-      </w:r>
-    </w:p>
-    <w:p>
-      <w:pPr>
-        <w:spacing w:before="100" w:beforeAutospacing="1" w:after="100" w:afterAutospacing="1" w:line="240" w:lineRule="auto"/>
-        <w:rPr>
-          <w:rFonts w:ascii="Courier New" w:eastAsia="Times New Roman" w:hAnsi="Courier New" w:cs="Courier New"/>
-          <w:sz w:val="18"/>
-          <w:szCs w:val="18"/>
-          <w:lang w:val="fr-FR"/>
-        </w:rPr>
-      </w:pPr>
-      <w:r>
-        <w:rPr>
-          <w:rFonts w:ascii="Courier New" w:eastAsia="Times New Roman" w:hAnsi="Courier New" w:cs="Courier New"/>
-          <w:sz w:val="18"/>
-          <w:szCs w:val="18"/>
-          <w:lang w:val="fr-FR"/>
-        </w:rPr>
-        <w:t>}</w:t>
-      </w:r>
-    </w:p>
-    <w:p>
-      <w:pPr>
-        <w:spacing w:before="100" w:beforeAutospacing="1" w:after="100" w:afterAutospacing="1" w:line="240" w:lineRule="auto"/>
-      </w:pPr>
-      <w:proofErr w:type="gramStart"/>
-      <w:r>
-        <w:t>Odjavom se briše isključivo token kojim je poslat zahtev za odjavu.</w:t>
-      </w:r>
-      <w:proofErr w:type="gramEnd"/>
-      <w:r>
-        <w:t xml:space="preserve"> Ostali tokeni istog korisnika nastavljaju da važe, čime je omogućeno da korisnik bude prijavljen </w:t>
-      </w:r>
-      <w:proofErr w:type="gramStart"/>
-      <w:r>
-        <w:t>sa</w:t>
-      </w:r>
-      <w:proofErr w:type="gramEnd"/>
-      <w:r>
-        <w:t xml:space="preserve"> više uređaja i da se odjavi sa svakog pojedinačno.</w:t>
-      </w:r>
-    </w:p>
-    <w:p>
-      <w:pPr>
-        <w:spacing w:before="100" w:beforeAutospacing="1" w:after="100" w:afterAutospacing="1" w:line="240" w:lineRule="auto"/>
-      </w:pPr>
     </w:p>
     <w:p>
       <w:pPr>
         <w:pStyle w:val="Heading2"/>
       </w:pPr>
-      <w:bookmarkStart w:id="11" w:name="_Toc238910171"/>
+      <w:bookmarkStart w:id="11" w:name="_Toc238910790"/>
       <w:r>
         <w:t>Rute i kontrola pristupa</w:t>
       </w:r>
@@ -8059,6 +8119,7 @@
     <w:p/>
     <w:p>
       <w:pPr>
+        <w:spacing w:after="160"/>
         <w:rPr>
           <w:rFonts w:ascii="Courier New" w:hAnsi="Courier New" w:cs="Courier New"/>
           <w:sz w:val="18"/>
@@ -8094,6 +8155,7 @@
     </w:p>
     <w:p>
       <w:pPr>
+        <w:spacing w:after="160"/>
         <w:rPr>
           <w:rFonts w:ascii="Courier New" w:hAnsi="Courier New" w:cs="Courier New"/>
           <w:sz w:val="18"/>
@@ -8129,15 +8191,17 @@
     </w:p>
     <w:p>
       <w:pPr>
-        <w:rPr>
-          <w:rFonts w:ascii="Courier New" w:hAnsi="Courier New" w:cs="Courier New"/>
-          <w:sz w:val="18"/>
-          <w:szCs w:val="18"/>
-        </w:rPr>
-      </w:pPr>
-    </w:p>
-    <w:p>
-      <w:pPr>
+        <w:spacing w:after="160"/>
+        <w:rPr>
+          <w:rFonts w:ascii="Courier New" w:hAnsi="Courier New" w:cs="Courier New"/>
+          <w:sz w:val="18"/>
+          <w:szCs w:val="18"/>
+        </w:rPr>
+      </w:pPr>
+    </w:p>
+    <w:p>
+      <w:pPr>
+        <w:spacing w:after="160"/>
         <w:rPr>
           <w:rFonts w:ascii="Courier New" w:hAnsi="Courier New" w:cs="Courier New"/>
           <w:sz w:val="18"/>
@@ -8173,6 +8237,7 @@
     </w:p>
     <w:p>
       <w:pPr>
+        <w:spacing w:after="160"/>
         <w:rPr>
           <w:rFonts w:ascii="Courier New" w:hAnsi="Courier New" w:cs="Courier New"/>
           <w:sz w:val="18"/>
@@ -8208,15 +8273,17 @@
     </w:p>
     <w:p>
       <w:pPr>
-        <w:rPr>
-          <w:rFonts w:ascii="Courier New" w:hAnsi="Courier New" w:cs="Courier New"/>
-          <w:sz w:val="18"/>
-          <w:szCs w:val="18"/>
-        </w:rPr>
-      </w:pPr>
-    </w:p>
-    <w:p>
-      <w:pPr>
+        <w:spacing w:after="160"/>
+        <w:rPr>
+          <w:rFonts w:ascii="Courier New" w:hAnsi="Courier New" w:cs="Courier New"/>
+          <w:sz w:val="18"/>
+          <w:szCs w:val="18"/>
+        </w:rPr>
+      </w:pPr>
+    </w:p>
+    <w:p>
+      <w:pPr>
+        <w:spacing w:after="160"/>
         <w:rPr>
           <w:rFonts w:ascii="Courier New" w:hAnsi="Courier New" w:cs="Courier New"/>
           <w:sz w:val="18"/>
@@ -8252,6 +8319,7 @@
     </w:p>
     <w:p>
       <w:pPr>
+        <w:spacing w:after="160"/>
         <w:rPr>
           <w:rFonts w:ascii="Courier New" w:hAnsi="Courier New" w:cs="Courier New"/>
           <w:sz w:val="18"/>
@@ -8287,15 +8355,7 @@
     </w:p>
     <w:p>
       <w:pPr>
-        <w:rPr>
-          <w:rFonts w:ascii="Courier New" w:hAnsi="Courier New" w:cs="Courier New"/>
-          <w:sz w:val="18"/>
-          <w:szCs w:val="18"/>
-        </w:rPr>
-      </w:pPr>
-    </w:p>
-    <w:p>
-      <w:pPr>
+        <w:spacing w:after="160"/>
         <w:rPr>
           <w:rFonts w:ascii="Courier New" w:hAnsi="Courier New" w:cs="Courier New"/>
           <w:sz w:val="18"/>
@@ -8317,6 +8377,88 @@
           <w:sz w:val="18"/>
           <w:szCs w:val="18"/>
         </w:rPr>
+        <w:t>apiResource(</w:t>
+      </w:r>
+      <w:proofErr w:type="gramEnd"/>
+      <w:r>
+        <w:rPr>
+          <w:rFonts w:ascii="Courier New" w:hAnsi="Courier New" w:cs="Courier New"/>
+          <w:sz w:val="18"/>
+          <w:szCs w:val="18"/>
+        </w:rPr>
+        <w:t>'teams', TeamController::class)-&gt;only(['index', 'show']);</w:t>
+      </w:r>
+    </w:p>
+    <w:p>
+      <w:pPr>
+        <w:spacing w:after="160"/>
+        <w:rPr>
+          <w:rFonts w:ascii="Courier New" w:hAnsi="Courier New" w:cs="Courier New"/>
+          <w:sz w:val="18"/>
+          <w:szCs w:val="18"/>
+        </w:rPr>
+      </w:pPr>
+      <w:r>
+        <w:rPr>
+          <w:rFonts w:ascii="Courier New" w:hAnsi="Courier New" w:cs="Courier New"/>
+          <w:sz w:val="18"/>
+          <w:szCs w:val="18"/>
+        </w:rPr>
+        <w:t>Route::</w:t>
+      </w:r>
+      <w:proofErr w:type="gramStart"/>
+      <w:r>
+        <w:rPr>
+          <w:rFonts w:ascii="Courier New" w:hAnsi="Courier New" w:cs="Courier New"/>
+          <w:sz w:val="18"/>
+          <w:szCs w:val="18"/>
+        </w:rPr>
+        <w:t>apiResource(</w:t>
+      </w:r>
+      <w:proofErr w:type="gramEnd"/>
+      <w:r>
+        <w:rPr>
+          <w:rFonts w:ascii="Courier New" w:hAnsi="Courier New" w:cs="Courier New"/>
+          <w:sz w:val="18"/>
+          <w:szCs w:val="18"/>
+        </w:rPr>
+        <w:t>'results', ResultController::class)-&gt;only(['index', 'show']);</w:t>
+      </w:r>
+    </w:p>
+    <w:p>
+      <w:pPr>
+        <w:spacing w:after="160"/>
+        <w:rPr>
+          <w:rFonts w:ascii="Courier New" w:hAnsi="Courier New" w:cs="Courier New"/>
+          <w:sz w:val="18"/>
+          <w:szCs w:val="18"/>
+        </w:rPr>
+      </w:pPr>
+    </w:p>
+    <w:p>
+      <w:pPr>
+        <w:spacing w:after="160"/>
+        <w:rPr>
+          <w:rFonts w:ascii="Courier New" w:hAnsi="Courier New" w:cs="Courier New"/>
+          <w:sz w:val="18"/>
+          <w:szCs w:val="18"/>
+        </w:rPr>
+      </w:pPr>
+      <w:r>
+        <w:rPr>
+          <w:rFonts w:ascii="Courier New" w:hAnsi="Courier New" w:cs="Courier New"/>
+          <w:sz w:val="18"/>
+          <w:szCs w:val="18"/>
+        </w:rPr>
+        <w:t>Route::</w:t>
+      </w:r>
+      <w:proofErr w:type="gramStart"/>
+      <w:r>
+        <w:rPr>
+          <w:rFonts w:ascii="Courier New" w:hAnsi="Courier New" w:cs="Courier New"/>
+          <w:sz w:val="18"/>
+          <w:szCs w:val="18"/>
+        </w:rPr>
         <w:t>middleware(</w:t>
       </w:r>
       <w:proofErr w:type="gramEnd"/>
@@ -8331,6 +8473,7 @@
     </w:p>
     <w:p>
       <w:pPr>
+        <w:spacing w:after="160"/>
         <w:rPr>
           <w:rFonts w:ascii="Courier New" w:hAnsi="Courier New" w:cs="Courier New"/>
           <w:sz w:val="18"/>
@@ -8366,15 +8509,17 @@
     </w:p>
     <w:p>
       <w:pPr>
-        <w:rPr>
-          <w:rFonts w:ascii="Courier New" w:hAnsi="Courier New" w:cs="Courier New"/>
-          <w:sz w:val="18"/>
-          <w:szCs w:val="18"/>
-        </w:rPr>
-      </w:pPr>
-    </w:p>
-    <w:p>
-      <w:pPr>
+        <w:spacing w:after="160"/>
+        <w:rPr>
+          <w:rFonts w:ascii="Courier New" w:hAnsi="Courier New" w:cs="Courier New"/>
+          <w:sz w:val="18"/>
+          <w:szCs w:val="18"/>
+        </w:rPr>
+      </w:pPr>
+    </w:p>
+    <w:p>
+      <w:pPr>
+        <w:spacing w:after="160"/>
         <w:rPr>
           <w:rFonts w:ascii="Courier New" w:hAnsi="Courier New" w:cs="Courier New"/>
           <w:sz w:val="18"/>
@@ -8410,18 +8555,20 @@
     </w:p>
     <w:p>
       <w:pPr>
-        <w:rPr>
-          <w:rFonts w:ascii="Courier New" w:hAnsi="Courier New" w:cs="Courier New"/>
-          <w:sz w:val="18"/>
-          <w:szCs w:val="18"/>
-        </w:rPr>
-      </w:pPr>
-      <w:r>
-        <w:rPr>
-          <w:rFonts w:ascii="Courier New" w:hAnsi="Courier New" w:cs="Courier New"/>
-          <w:sz w:val="18"/>
-          <w:szCs w:val="18"/>
-        </w:rPr>
+        <w:spacing w:after="160"/>
+        <w:rPr>
+          <w:rFonts w:ascii="Courier New" w:hAnsi="Courier New" w:cs="Courier New"/>
+          <w:sz w:val="18"/>
+          <w:szCs w:val="18"/>
+        </w:rPr>
+      </w:pPr>
+      <w:r>
+        <w:rPr>
+          <w:rFonts w:ascii="Courier New" w:hAnsi="Courier New" w:cs="Courier New"/>
+          <w:sz w:val="18"/>
+          <w:szCs w:val="18"/>
+        </w:rPr>
+        <w:lastRenderedPageBreak/>
         <w:t xml:space="preserve">    Route::</w:t>
       </w:r>
       <w:proofErr w:type="gramStart"/>
@@ -8444,14 +8591,89 @@
       </w:r>
     </w:p>
     <w:p>
-      <w:r>
+      <w:pPr>
+        <w:spacing w:after="160"/>
+        <w:rPr>
+          <w:rFonts w:ascii="Courier New" w:hAnsi="Courier New" w:cs="Courier New"/>
+          <w:sz w:val="18"/>
+          <w:szCs w:val="18"/>
+        </w:rPr>
+      </w:pPr>
+      <w:r>
+        <w:rPr>
+          <w:rFonts w:ascii="Courier New" w:hAnsi="Courier New" w:cs="Courier New"/>
+          <w:sz w:val="18"/>
+          <w:szCs w:val="18"/>
+        </w:rPr>
+        <w:t xml:space="preserve">    Route::</w:t>
+      </w:r>
+      <w:proofErr w:type="gramStart"/>
+      <w:r>
+        <w:rPr>
+          <w:rFonts w:ascii="Courier New" w:hAnsi="Courier New" w:cs="Courier New"/>
+          <w:sz w:val="18"/>
+          <w:szCs w:val="18"/>
+        </w:rPr>
+        <w:t>apiResource(</w:t>
+      </w:r>
+      <w:proofErr w:type="gramEnd"/>
+      <w:r>
+        <w:rPr>
+          <w:rFonts w:ascii="Courier New" w:hAnsi="Courier New" w:cs="Courier New"/>
+          <w:sz w:val="18"/>
+          <w:szCs w:val="18"/>
+        </w:rPr>
+        <w:t>'teams', TeamController::class)-&gt;except(['index', 'show']);</w:t>
+      </w:r>
+    </w:p>
+    <w:p>
+      <w:pPr>
+        <w:spacing w:after="160"/>
+        <w:rPr>
+          <w:rFonts w:ascii="Courier New" w:hAnsi="Courier New" w:cs="Courier New"/>
+          <w:sz w:val="18"/>
+          <w:szCs w:val="18"/>
+        </w:rPr>
+      </w:pPr>
+      <w:r>
+        <w:rPr>
+          <w:rFonts w:ascii="Courier New" w:hAnsi="Courier New" w:cs="Courier New"/>
+          <w:sz w:val="18"/>
+          <w:szCs w:val="18"/>
+        </w:rPr>
+        <w:t xml:space="preserve">    Route::</w:t>
+      </w:r>
+      <w:proofErr w:type="gramStart"/>
+      <w:r>
+        <w:rPr>
+          <w:rFonts w:ascii="Courier New" w:hAnsi="Courier New" w:cs="Courier New"/>
+          <w:sz w:val="18"/>
+          <w:szCs w:val="18"/>
+        </w:rPr>
+        <w:t>apiResource(</w:t>
+      </w:r>
+      <w:proofErr w:type="gramEnd"/>
+      <w:r>
+        <w:rPr>
+          <w:rFonts w:ascii="Courier New" w:hAnsi="Courier New" w:cs="Courier New"/>
+          <w:sz w:val="18"/>
+          <w:szCs w:val="18"/>
+        </w:rPr>
+        <w:t>'results', ResultController::class)-&gt;except(['index', 'show']);</w:t>
+      </w:r>
+    </w:p>
+    <w:p>
+      <w:pPr>
+        <w:spacing w:after="160"/>
+      </w:pPr>
+      <w:r>
+        <w:rPr>
+          <w:rFonts w:ascii="Courier New" w:hAnsi="Courier New" w:cs="Courier New"/>
+          <w:sz w:val="18"/>
+          <w:szCs w:val="18"/>
+        </w:rPr>
         <w:t>});</w:t>
       </w:r>
-    </w:p>
-    <w:p>
-      <w:pPr>
-        <w:spacing w:after="160"/>
-      </w:pPr>
       <w:r>
         <w:br w:type="page"/>
       </w:r>
@@ -9250,7 +9472,7 @@
       <w:pPr>
         <w:pStyle w:val="Heading2"/>
       </w:pPr>
-      <w:bookmarkStart w:id="12" w:name="_Toc238910172"/>
+      <w:bookmarkStart w:id="12" w:name="_Toc238910791"/>
       <w:r>
         <w:t>Prikaz aktuelnih događaja</w:t>
       </w:r>
@@ -9734,7 +9956,7 @@
       <w:pPr>
         <w:pStyle w:val="Heading2"/>
       </w:pPr>
-      <w:bookmarkStart w:id="13" w:name="_Toc238910173"/>
+      <w:bookmarkStart w:id="13" w:name="_Toc238910792"/>
       <w:r>
         <w:lastRenderedPageBreak/>
         <w:t>Filtriranje i paginacija</w:t>
@@ -10302,7 +10524,7 @@
       <w:pPr>
         <w:pStyle w:val="Heading2"/>
       </w:pPr>
-      <w:bookmarkStart w:id="14" w:name="_Toc238910174"/>
+      <w:bookmarkStart w:id="14" w:name="_Toc238910793"/>
       <w:r>
         <w:lastRenderedPageBreak/>
         <w:t>Rang lista timova</w:t>
@@ -11160,7 +11382,7 @@
       <w:pPr>
         <w:pStyle w:val="Heading2"/>
       </w:pPr>
-      <w:bookmarkStart w:id="15" w:name="_Toc238910175"/>
+      <w:bookmarkStart w:id="15" w:name="_Toc238910794"/>
       <w:r>
         <w:t>Obrada grešaka u JSON format</w:t>
       </w:r>
@@ -11999,7 +12221,7 @@
       <w:pPr>
         <w:pStyle w:val="Heading2"/>
       </w:pPr>
-      <w:bookmarkStart w:id="16" w:name="_Toc238910176"/>
+      <w:bookmarkStart w:id="16" w:name="_Toc238910795"/>
       <w:r>
         <w:t xml:space="preserve">Zaštita </w:t>
       </w:r>
@@ -12288,7 +12510,7 @@
       <w:pPr>
         <w:pStyle w:val="Heading1"/>
       </w:pPr>
-      <w:bookmarkStart w:id="17" w:name="_Toc238910177"/>
+      <w:bookmarkStart w:id="17" w:name="_Toc238910796"/>
       <w:r>
         <w:lastRenderedPageBreak/>
         <w:t>Korisničko uputstvo</w:t>
@@ -12324,7 +12546,7 @@
       <w:pPr>
         <w:pStyle w:val="Heading2"/>
       </w:pPr>
-      <w:bookmarkStart w:id="18" w:name="_Toc238910178"/>
+      <w:bookmarkStart w:id="18" w:name="_Toc238910797"/>
       <w:r>
         <w:t>Registracija korisnika</w:t>
       </w:r>
@@ -12480,7 +12702,7 @@
       <w:pPr>
         <w:pStyle w:val="Heading2"/>
       </w:pPr>
-      <w:bookmarkStart w:id="19" w:name="_Toc238910179"/>
+      <w:bookmarkStart w:id="19" w:name="_Toc238910798"/>
       <w:r>
         <w:t>Prijava korisnika</w:t>
       </w:r>
@@ -12668,7 +12890,7 @@
           <w:lang w:val="fr-FR"/>
         </w:rPr>
       </w:pPr>
-      <w:bookmarkStart w:id="20" w:name="_Toc238910180"/>
+      <w:bookmarkStart w:id="20" w:name="_Toc238910799"/>
       <w:r>
         <w:rPr>
           <w:lang w:val="fr-FR"/>
@@ -12823,7 +13045,7 @@
       <w:r>
         <w:t xml:space="preserve"> </w:t>
       </w:r>
-      <w:bookmarkStart w:id="21" w:name="_Toc238910181"/>
+      <w:bookmarkStart w:id="21" w:name="_Toc238910800"/>
       <w:r>
         <w:t>Pristup zaštićenoj ruti bez tokena</w:t>
       </w:r>
@@ -12978,7 +13200,7 @@
       <w:r>
         <w:t xml:space="preserve"> </w:t>
       </w:r>
-      <w:bookmarkStart w:id="22" w:name="_Toc238910182"/>
+      <w:bookmarkStart w:id="22" w:name="_Toc238910801"/>
       <w:r>
         <w:t>Kreiranje sezone</w:t>
       </w:r>
@@ -13147,7 +13369,7 @@
       <w:pPr>
         <w:pStyle w:val="Heading2"/>
       </w:pPr>
-      <w:bookmarkStart w:id="23" w:name="_Toc238910183"/>
+      <w:bookmarkStart w:id="23" w:name="_Toc238910802"/>
       <w:r>
         <w:t>Provera ispravnosti podataka</w:t>
       </w:r>
@@ -13299,7 +13521,7 @@
       <w:pPr>
         <w:pStyle w:val="Heading2"/>
       </w:pPr>
-      <w:bookmarkStart w:id="24" w:name="_Toc238910184"/>
+      <w:bookmarkStart w:id="24" w:name="_Toc238910803"/>
       <w:r>
         <w:t>Pregled svih sezona</w:t>
       </w:r>
@@ -13468,7 +13690,7 @@
       <w:pPr>
         <w:pStyle w:val="Heading2"/>
       </w:pPr>
-      <w:bookmarkStart w:id="25" w:name="_Toc238910185"/>
+      <w:bookmarkStart w:id="25" w:name="_Toc238910804"/>
       <w:r>
         <w:t>Registracija tima</w:t>
       </w:r>
@@ -13637,7 +13859,7 @@
       <w:pPr>
         <w:pStyle w:val="Heading2"/>
       </w:pPr>
-      <w:bookmarkStart w:id="26" w:name="_Toc238910186"/>
+      <w:bookmarkStart w:id="26" w:name="_Toc238910805"/>
       <w:r>
         <w:t>Pregled timova</w:t>
       </w:r>
@@ -13769,7 +13991,7 @@
       <w:pPr>
         <w:pStyle w:val="Heading2"/>
       </w:pPr>
-      <w:bookmarkStart w:id="27" w:name="_Toc238910187"/>
+      <w:bookmarkStart w:id="27" w:name="_Toc238910806"/>
       <w:r>
         <w:t>Kreiranje događaja</w:t>
       </w:r>
@@ -13907,7 +14129,7 @@
       <w:pPr>
         <w:pStyle w:val="Heading2"/>
       </w:pPr>
-      <w:bookmarkStart w:id="28" w:name="_Toc238910188"/>
+      <w:bookmarkStart w:id="28" w:name="_Toc238910807"/>
       <w:r>
         <w:t>Prikaz aktuelnih događaja</w:t>
       </w:r>
@@ -14066,7 +14288,7 @@
       <w:pPr>
         <w:pStyle w:val="Heading2"/>
       </w:pPr>
-      <w:bookmarkStart w:id="29" w:name="_Toc238910189"/>
+      <w:bookmarkStart w:id="29" w:name="_Toc238910808"/>
       <w:r>
         <w:t>Upis rezultata</w:t>
       </w:r>
@@ -14204,7 +14426,7 @@
       <w:pPr>
         <w:pStyle w:val="Heading2"/>
       </w:pPr>
-      <w:bookmarkStart w:id="30" w:name="_Toc238910190"/>
+      <w:bookmarkStart w:id="30" w:name="_Toc238910809"/>
       <w:r>
         <w:t>Sprečavanje dvostrukog unosa</w:t>
       </w:r>
@@ -14364,7 +14586,7 @@
       <w:pPr>
         <w:pStyle w:val="Heading2"/>
       </w:pPr>
-      <w:bookmarkStart w:id="31" w:name="_Toc238910191"/>
+      <w:bookmarkStart w:id="31" w:name="_Toc238910810"/>
       <w:r>
         <w:t>Rang lista timova</w:t>
       </w:r>
@@ -14564,7 +14786,7 @@
       <w:pPr>
         <w:pStyle w:val="Heading2"/>
       </w:pPr>
-      <w:bookmarkStart w:id="32" w:name="_Toc238910192"/>
+      <w:bookmarkStart w:id="32" w:name="_Toc238910811"/>
       <w:r>
         <w:t>Filtriranje i paginacija</w:t>
       </w:r>
@@ -14678,7 +14900,7 @@
       <w:pPr>
         <w:pStyle w:val="Heading2"/>
       </w:pPr>
-      <w:bookmarkStart w:id="33" w:name="_Toc238910193"/>
+      <w:bookmarkStart w:id="33" w:name="_Toc238910812"/>
       <w:r>
         <w:t>Odjava korisnika</w:t>
       </w:r>
@@ -14797,7 +15019,7 @@
       <w:pPr>
         <w:pStyle w:val="Heading2"/>
       </w:pPr>
-      <w:bookmarkStart w:id="34" w:name="_Toc238910194"/>
+      <w:bookmarkStart w:id="34" w:name="_Toc238910813"/>
       <w:r>
         <w:t>Provera nevažećeg tokena</w:t>
       </w:r>
@@ -17222,7 +17444,7 @@
   <a:extraClrSchemeLst/>
   <a:extLst>
     <a:ext uri="{05A4C25C-085E-4340-85A3-A5531E510DB2}">
-      <thm15:themeFamily xmlns="" xmlns:thm15="http://schemas.microsoft.com/office/thememl/2012/main" name="Office Theme" id="{62F939B6-93AF-4DB8-9C6B-D6C7DFDC589F}" vid="{4A3C46E8-61CC-4603-A589-7422A47A8E4A}"/>
+      <thm15:themeFamily xmlns:thm15="http://schemas.microsoft.com/office/thememl/2012/main" xmlns="" name="Office Theme" id="{62F939B6-93AF-4DB8-9C6B-D6C7DFDC589F}" vid="{4A3C46E8-61CC-4603-A589-7422A47A8E4A}"/>
     </a:ext>
   </a:extLst>
 </a:theme>
@@ -17233,7 +17455,7 @@
 </file>
 
 <file path=customXml/itemProps1.xml><?xml version="1.0" encoding="utf-8"?>
-<ds:datastoreItem xmlns:ds="http://schemas.openxmlformats.org/officeDocument/2006/customXml" ds:itemID="{E4A1C697-A70C-4A25-AFCA-908583BDC142}">
+<ds:datastoreItem xmlns:ds="http://schemas.openxmlformats.org/officeDocument/2006/customXml" ds:itemID="{E05EEBCD-97C0-47D7-AB28-45580EE48592}">
   <ds:schemaRefs>
     <ds:schemaRef ds:uri="http://schemas.openxmlformats.org/officeDocument/2006/bibliography"/>
   </ds:schemaRefs>

</xml_diff>